<commit_message>
a little latex corrected in script
</commit_message>
<xml_diff>
--- a/MS_Thesis_Document.docx
+++ b/MS_Thesis_Document.docx
@@ -154,7 +154,7 @@
             <m:sSubPr>
               <m:ctrlPr>
                 <w:rPr>
-                  <w:rFonts w:ascii="Cambria Math" w:hAnsi="Cambria Math"/>
+                  <w:rFonts w:ascii="Cambria Math" w:eastAsia="Cambria Math" w:hAnsi="Cambria Math" w:cs="Cambria Math"/>
                   <w:i/>
                 </w:rPr>
               </m:ctrlPr>
@@ -162,7 +162,7 @@
             <m:e>
               <m:r>
                 <w:rPr>
-                  <w:rFonts w:ascii="Cambria Math" w:hAnsi="Cambria Math"/>
+                  <w:rFonts w:ascii="Cambria Math" w:eastAsia="Cambria Math" w:hAnsi="Cambria Math" w:cs="Cambria Math"/>
                 </w:rPr>
                 <m:t>f</m:t>
               </m:r>
@@ -170,7 +170,7 @@
             <m:sub>
               <m:r>
                 <w:rPr>
-                  <w:rFonts w:ascii="Cambria Math" w:hAnsi="Cambria Math"/>
+                  <w:rFonts w:ascii="Cambria Math" w:eastAsia="Cambria Math" w:hAnsi="Cambria Math" w:cs="Cambria Math"/>
                 </w:rPr>
                 <m:t>n</m:t>
               </m:r>
@@ -178,7 +178,7 @@
           </m:sSub>
           <m:r>
             <w:rPr>
-              <w:rFonts w:ascii="Cambria Math" w:hAnsi="Cambria Math"/>
+              <w:rFonts w:ascii="Cambria Math" w:eastAsia="Cambria Math" w:hAnsi="Cambria Math" w:cs="Cambria Math"/>
             </w:rPr>
             <m:t>=</m:t>
           </m:r>
@@ -186,20 +186,20 @@
             <m:fPr>
               <m:ctrlPr>
                 <w:rPr>
-                  <w:rFonts w:ascii="Cambria Math" w:hAnsi="Cambria Math"/>
+                  <w:rFonts w:ascii="Cambria Math" w:eastAsia="Cambria Math" w:hAnsi="Cambria Math" w:cs="Cambria Math"/>
                 </w:rPr>
               </m:ctrlPr>
             </m:fPr>
             <m:num>
               <m:r>
                 <w:rPr>
-                  <w:rFonts w:ascii="Cambria Math" w:hAnsi="Cambria Math"/>
+                  <w:rFonts w:ascii="Cambria Math" w:eastAsia="Cambria Math" w:hAnsi="Cambria Math" w:cs="Cambria Math"/>
                 </w:rPr>
                 <m:t>1</m:t>
               </m:r>
               <m:ctrlPr>
                 <w:rPr>
-                  <w:rFonts w:ascii="Cambria Math" w:hAnsi="Cambria Math"/>
+                  <w:rFonts w:ascii="Cambria Math" w:eastAsia="Cambria Math" w:hAnsi="Cambria Math" w:cs="Cambria Math"/>
                   <w:i/>
                 </w:rPr>
               </m:ctrlPr>
@@ -207,7 +207,7 @@
             <m:den>
               <m:r>
                 <w:rPr>
-                  <w:rFonts w:ascii="Cambria Math" w:hAnsi="Cambria Math"/>
+                  <w:rFonts w:ascii="Cambria Math" w:eastAsia="Cambria Math" w:hAnsi="Cambria Math" w:cs="Cambria Math"/>
                 </w:rPr>
                 <m:t>2</m:t>
               </m:r>
@@ -216,13 +216,13 @@
                   <m:sty m:val="p"/>
                 </m:rPr>
                 <w:rPr>
-                  <w:rFonts w:ascii="Cambria Math" w:hAnsi="Cambria Math"/>
+                  <w:rFonts w:ascii="Cambria Math" w:eastAsia="Cambria Math" w:hAnsi="Cambria Math" w:cs="Cambria Math"/>
                 </w:rPr>
                 <m:t>π</m:t>
               </m:r>
               <m:ctrlPr>
                 <w:rPr>
-                  <w:rFonts w:ascii="Cambria Math" w:hAnsi="Cambria Math"/>
+                  <w:rFonts w:ascii="Cambria Math" w:eastAsia="Cambria Math" w:hAnsi="Cambria Math" w:cs="Cambria Math"/>
                   <w:i/>
                 </w:rPr>
               </m:ctrlPr>
@@ -233,14 +233,14 @@
               <m:degHide m:val="1"/>
               <m:ctrlPr>
                 <w:rPr>
-                  <w:rFonts w:ascii="Cambria Math" w:hAnsi="Cambria Math"/>
+                  <w:rFonts w:ascii="Cambria Math" w:eastAsia="Cambria Math" w:hAnsi="Cambria Math" w:cs="Cambria Math"/>
                 </w:rPr>
               </m:ctrlPr>
             </m:radPr>
             <m:deg>
               <m:ctrlPr>
                 <w:rPr>
-                  <w:rFonts w:ascii="Cambria Math" w:hAnsi="Cambria Math"/>
+                  <w:rFonts w:ascii="Cambria Math" w:eastAsia="Cambria Math" w:hAnsi="Cambria Math" w:cs="Cambria Math"/>
                   <w:i/>
                 </w:rPr>
               </m:ctrlPr>
@@ -250,20 +250,20 @@
                 <m:fPr>
                   <m:ctrlPr>
                     <w:rPr>
-                      <w:rFonts w:ascii="Cambria Math" w:hAnsi="Cambria Math"/>
+                      <w:rFonts w:ascii="Cambria Math" w:eastAsia="Cambria Math" w:hAnsi="Cambria Math" w:cs="Cambria Math"/>
                     </w:rPr>
                   </m:ctrlPr>
                 </m:fPr>
                 <m:num>
                   <m:r>
                     <w:rPr>
-                      <w:rFonts w:ascii="Cambria Math" w:hAnsi="Cambria Math"/>
+                      <w:rFonts w:ascii="Cambria Math" w:eastAsia="Cambria Math" w:hAnsi="Cambria Math" w:cs="Cambria Math"/>
                     </w:rPr>
                     <m:t>k</m:t>
                   </m:r>
                   <m:ctrlPr>
                     <w:rPr>
-                      <w:rFonts w:ascii="Cambria Math" w:hAnsi="Cambria Math"/>
+                      <w:rFonts w:ascii="Cambria Math" w:eastAsia="Cambria Math" w:hAnsi="Cambria Math" w:cs="Cambria Math"/>
                       <w:i/>
                     </w:rPr>
                   </m:ctrlPr>
@@ -271,13 +271,13 @@
                 <m:den>
                   <m:r>
                     <w:rPr>
-                      <w:rFonts w:ascii="Cambria Math" w:hAnsi="Cambria Math"/>
+                      <w:rFonts w:ascii="Cambria Math" w:eastAsia="Cambria Math" w:hAnsi="Cambria Math" w:cs="Cambria Math"/>
                     </w:rPr>
                     <m:t>m</m:t>
                   </m:r>
                   <m:ctrlPr>
                     <w:rPr>
-                      <w:rFonts w:ascii="Cambria Math" w:hAnsi="Cambria Math"/>
+                      <w:rFonts w:ascii="Cambria Math" w:eastAsia="Cambria Math" w:hAnsi="Cambria Math" w:cs="Cambria Math"/>
                       <w:i/>
                     </w:rPr>
                   </m:ctrlPr>
@@ -290,7 +290,7 @@
               <m:sty m:val="p"/>
             </m:rPr>
             <w:rPr>
-              <w:rFonts w:ascii="Cambria Math" w:hAnsi="Cambria Math"/>
+              <w:rFonts w:ascii="Cambria Math" w:eastAsia="Cambria Math" w:hAnsi="Cambria Math" w:cs="Cambria Math"/>
             </w:rPr>
             <m:t> </m:t>
           </m:r>
@@ -299,7 +299,7 @@
               <m:nor/>
             </m:rPr>
             <w:rPr>
-              <w:rFonts w:ascii="Cambria Math" w:hAnsi="Cambria Math"/>
+              <w:rFonts w:ascii="Cambria Math" w:eastAsia="Cambria Math" w:hAnsi="Cambria Math" w:cs="Cambria Math"/>
             </w:rPr>
             <m:t>(Eq. 1)</m:t>
           </m:r>
@@ -1197,7 +1197,7 @@
             <m:sSubPr>
               <m:ctrlPr>
                 <w:rPr>
-                  <w:rFonts w:ascii="Cambria Math" w:hAnsi="Cambria Math"/>
+                  <w:rFonts w:ascii="Cambria Math" w:eastAsia="Cambria Math" w:hAnsi="Cambria Math" w:cs="Cambria Math"/>
                   <w:i/>
                 </w:rPr>
               </m:ctrlPr>
@@ -1205,7 +1205,7 @@
             <m:e>
               <m:r>
                 <w:rPr>
-                  <w:rFonts w:ascii="Cambria Math" w:hAnsi="Cambria Math"/>
+                  <w:rFonts w:ascii="Cambria Math" w:eastAsia="Cambria Math" w:hAnsi="Cambria Math" w:cs="Cambria Math"/>
                 </w:rPr>
                 <m:t>f</m:t>
               </m:r>
@@ -1213,7 +1213,7 @@
             <m:sub>
               <m:r>
                 <w:rPr>
-                  <w:rFonts w:ascii="Cambria Math" w:hAnsi="Cambria Math"/>
+                  <w:rFonts w:ascii="Cambria Math" w:eastAsia="Cambria Math" w:hAnsi="Cambria Math" w:cs="Cambria Math"/>
                 </w:rPr>
                 <m:t>n</m:t>
               </m:r>
@@ -1221,7 +1221,7 @@
           </m:sSub>
           <m:r>
             <w:rPr>
-              <w:rFonts w:ascii="Cambria Math" w:hAnsi="Cambria Math"/>
+              <w:rFonts w:ascii="Cambria Math" w:eastAsia="Cambria Math" w:hAnsi="Cambria Math" w:cs="Cambria Math"/>
             </w:rPr>
             <m:t>=</m:t>
           </m:r>
@@ -1229,7 +1229,7 @@
             <m:fPr>
               <m:ctrlPr>
                 <w:rPr>
-                  <w:rFonts w:ascii="Cambria Math" w:hAnsi="Cambria Math"/>
+                  <w:rFonts w:ascii="Cambria Math" w:eastAsia="Cambria Math" w:hAnsi="Cambria Math" w:cs="Cambria Math"/>
                 </w:rPr>
               </m:ctrlPr>
             </m:fPr>
@@ -1238,7 +1238,7 @@
                 <m:sSubSupPr>
                   <m:ctrlPr>
                     <w:rPr>
-                      <w:rFonts w:ascii="Cambria Math" w:hAnsi="Cambria Math"/>
+                      <w:rFonts w:ascii="Cambria Math" w:eastAsia="Cambria Math" w:hAnsi="Cambria Math" w:cs="Cambria Math"/>
                       <w:i/>
                     </w:rPr>
                   </m:ctrlPr>
@@ -1249,7 +1249,7 @@
                       <m:sty m:val="p"/>
                     </m:rPr>
                     <w:rPr>
-                      <w:rFonts w:ascii="Cambria Math" w:hAnsi="Cambria Math"/>
+                      <w:rFonts w:ascii="Cambria Math" w:eastAsia="Cambria Math" w:hAnsi="Cambria Math" w:cs="Cambria Math"/>
                     </w:rPr>
                     <m:t>λ</m:t>
                   </m:r>
@@ -1257,7 +1257,7 @@
                 <m:sub>
                   <m:r>
                     <w:rPr>
-                      <w:rFonts w:ascii="Cambria Math" w:hAnsi="Cambria Math"/>
+                      <w:rFonts w:ascii="Cambria Math" w:eastAsia="Cambria Math" w:hAnsi="Cambria Math" w:cs="Cambria Math"/>
                     </w:rPr>
                     <m:t>n</m:t>
                   </m:r>
@@ -1265,7 +1265,7 @@
                 <m:sup>
                   <m:r>
                     <w:rPr>
-                      <w:rFonts w:ascii="Cambria Math" w:hAnsi="Cambria Math"/>
+                      <w:rFonts w:ascii="Cambria Math" w:eastAsia="Cambria Math" w:hAnsi="Cambria Math" w:cs="Cambria Math"/>
                     </w:rPr>
                     <m:t>2</m:t>
                   </m:r>
@@ -1273,7 +1273,7 @@
               </m:sSubSup>
               <m:ctrlPr>
                 <w:rPr>
-                  <w:rFonts w:ascii="Cambria Math" w:hAnsi="Cambria Math"/>
+                  <w:rFonts w:ascii="Cambria Math" w:eastAsia="Cambria Math" w:hAnsi="Cambria Math" w:cs="Cambria Math"/>
                   <w:i/>
                 </w:rPr>
               </m:ctrlPr>
@@ -1281,7 +1281,7 @@
             <m:den>
               <m:r>
                 <w:rPr>
-                  <w:rFonts w:ascii="Cambria Math" w:hAnsi="Cambria Math"/>
+                  <w:rFonts w:ascii="Cambria Math" w:eastAsia="Cambria Math" w:hAnsi="Cambria Math" w:cs="Cambria Math"/>
                 </w:rPr>
                 <m:t>2</m:t>
               </m:r>
@@ -1290,7 +1290,7 @@
                   <m:sty m:val="p"/>
                 </m:rPr>
                 <w:rPr>
-                  <w:rFonts w:ascii="Cambria Math" w:hAnsi="Cambria Math"/>
+                  <w:rFonts w:ascii="Cambria Math" w:eastAsia="Cambria Math" w:hAnsi="Cambria Math" w:cs="Cambria Math"/>
                 </w:rPr>
                 <m:t>π</m:t>
               </m:r>
@@ -1298,7 +1298,7 @@
                 <m:sSupPr>
                   <m:ctrlPr>
                     <w:rPr>
-                      <w:rFonts w:ascii="Cambria Math" w:hAnsi="Cambria Math"/>
+                      <w:rFonts w:ascii="Cambria Math" w:eastAsia="Cambria Math" w:hAnsi="Cambria Math" w:cs="Cambria Math"/>
                       <w:i/>
                     </w:rPr>
                   </m:ctrlPr>
@@ -1306,7 +1306,7 @@
                 <m:e>
                   <m:r>
                     <w:rPr>
-                      <w:rFonts w:ascii="Cambria Math" w:hAnsi="Cambria Math"/>
+                      <w:rFonts w:ascii="Cambria Math" w:eastAsia="Cambria Math" w:hAnsi="Cambria Math" w:cs="Cambria Math"/>
                     </w:rPr>
                     <m:t>L</m:t>
                   </m:r>
@@ -1314,7 +1314,7 @@
                 <m:sup>
                   <m:r>
                     <w:rPr>
-                      <w:rFonts w:ascii="Cambria Math" w:hAnsi="Cambria Math"/>
+                      <w:rFonts w:ascii="Cambria Math" w:eastAsia="Cambria Math" w:hAnsi="Cambria Math" w:cs="Cambria Math"/>
                     </w:rPr>
                     <m:t>2</m:t>
                   </m:r>
@@ -1322,7 +1322,7 @@
               </m:sSup>
               <m:ctrlPr>
                 <w:rPr>
-                  <w:rFonts w:ascii="Cambria Math" w:hAnsi="Cambria Math"/>
+                  <w:rFonts w:ascii="Cambria Math" w:eastAsia="Cambria Math" w:hAnsi="Cambria Math" w:cs="Cambria Math"/>
                   <w:i/>
                 </w:rPr>
               </m:ctrlPr>
@@ -1333,14 +1333,14 @@
               <m:degHide m:val="1"/>
               <m:ctrlPr>
                 <w:rPr>
-                  <w:rFonts w:ascii="Cambria Math" w:hAnsi="Cambria Math"/>
+                  <w:rFonts w:ascii="Cambria Math" w:eastAsia="Cambria Math" w:hAnsi="Cambria Math" w:cs="Cambria Math"/>
                 </w:rPr>
               </m:ctrlPr>
             </m:radPr>
             <m:deg>
               <m:ctrlPr>
                 <w:rPr>
-                  <w:rFonts w:ascii="Cambria Math" w:hAnsi="Cambria Math"/>
+                  <w:rFonts w:ascii="Cambria Math" w:eastAsia="Cambria Math" w:hAnsi="Cambria Math" w:cs="Cambria Math"/>
                   <w:i/>
                 </w:rPr>
               </m:ctrlPr>
@@ -1350,20 +1350,20 @@
                 <m:fPr>
                   <m:ctrlPr>
                     <w:rPr>
-                      <w:rFonts w:ascii="Cambria Math" w:hAnsi="Cambria Math"/>
+                      <w:rFonts w:ascii="Cambria Math" w:eastAsia="Cambria Math" w:hAnsi="Cambria Math" w:cs="Cambria Math"/>
                     </w:rPr>
                   </m:ctrlPr>
                 </m:fPr>
                 <m:num>
                   <m:r>
                     <w:rPr>
-                      <w:rFonts w:ascii="Cambria Math" w:hAnsi="Cambria Math"/>
+                      <w:rFonts w:ascii="Cambria Math" w:eastAsia="Cambria Math" w:hAnsi="Cambria Math" w:cs="Cambria Math"/>
                     </w:rPr>
                     <m:t>EI</m:t>
                   </m:r>
                   <m:ctrlPr>
                     <w:rPr>
-                      <w:rFonts w:ascii="Cambria Math" w:hAnsi="Cambria Math"/>
+                      <w:rFonts w:ascii="Cambria Math" w:eastAsia="Cambria Math" w:hAnsi="Cambria Math" w:cs="Cambria Math"/>
                       <w:i/>
                     </w:rPr>
                   </m:ctrlPr>
@@ -1374,19 +1374,19 @@
                       <m:sty m:val="p"/>
                     </m:rPr>
                     <w:rPr>
-                      <w:rFonts w:ascii="Cambria Math" w:hAnsi="Cambria Math"/>
+                      <w:rFonts w:ascii="Cambria Math" w:eastAsia="Cambria Math" w:hAnsi="Cambria Math" w:cs="Cambria Math"/>
                     </w:rPr>
                     <m:t>ρ</m:t>
                   </m:r>
                   <m:r>
                     <w:rPr>
-                      <w:rFonts w:ascii="Cambria Math" w:hAnsi="Cambria Math"/>
+                      <w:rFonts w:ascii="Cambria Math" w:eastAsia="Cambria Math" w:hAnsi="Cambria Math" w:cs="Cambria Math"/>
                     </w:rPr>
                     <m:t>A</m:t>
                   </m:r>
                   <m:ctrlPr>
                     <w:rPr>
-                      <w:rFonts w:ascii="Cambria Math" w:hAnsi="Cambria Math"/>
+                      <w:rFonts w:ascii="Cambria Math" w:eastAsia="Cambria Math" w:hAnsi="Cambria Math" w:cs="Cambria Math"/>
                       <w:i/>
                     </w:rPr>
                   </m:ctrlPr>
@@ -1399,7 +1399,7 @@
               <m:sty m:val="p"/>
             </m:rPr>
             <w:rPr>
-              <w:rFonts w:ascii="Cambria Math" w:hAnsi="Cambria Math"/>
+              <w:rFonts w:ascii="Cambria Math" w:eastAsia="Cambria Math" w:hAnsi="Cambria Math" w:cs="Cambria Math"/>
             </w:rPr>
             <m:t> </m:t>
           </m:r>
@@ -1408,7 +1408,7 @@
               <m:nor/>
             </m:rPr>
             <w:rPr>
-              <w:rFonts w:ascii="Cambria Math" w:hAnsi="Cambria Math"/>
+              <w:rFonts w:ascii="Cambria Math" w:eastAsia="Cambria Math" w:hAnsi="Cambria Math" w:cs="Cambria Math"/>
             </w:rPr>
             <m:t>(Eq. 2)</m:t>
           </m:r>
@@ -1452,7 +1452,7 @@
             <m:sSubPr>
               <m:ctrlPr>
                 <w:rPr>
-                  <w:rFonts w:ascii="Cambria Math" w:hAnsi="Cambria Math"/>
+                  <w:rFonts w:ascii="Cambria Math" w:eastAsia="Cambria Math" w:hAnsi="Cambria Math" w:cs="Cambria Math"/>
                   <w:i/>
                 </w:rPr>
               </m:ctrlPr>
@@ -1460,7 +1460,7 @@
             <m:e>
               <m:r>
                 <w:rPr>
-                  <w:rFonts w:ascii="Cambria Math" w:hAnsi="Cambria Math"/>
+                  <w:rFonts w:ascii="Cambria Math" w:eastAsia="Cambria Math" w:hAnsi="Cambria Math" w:cs="Cambria Math"/>
                 </w:rPr>
                 <m:t>E</m:t>
               </m:r>
@@ -1468,7 +1468,7 @@
             <m:sub>
               <m:r>
                 <w:rPr>
-                  <w:rFonts w:ascii="Cambria Math" w:hAnsi="Cambria Math"/>
+                  <w:rFonts w:ascii="Cambria Math" w:eastAsia="Cambria Math" w:hAnsi="Cambria Math" w:cs="Cambria Math"/>
                 </w:rPr>
                 <m:t>c</m:t>
               </m:r>
@@ -1476,7 +1476,7 @@
           </m:sSub>
           <m:r>
             <w:rPr>
-              <w:rFonts w:ascii="Cambria Math" w:hAnsi="Cambria Math"/>
+              <w:rFonts w:ascii="Cambria Math" w:eastAsia="Cambria Math" w:hAnsi="Cambria Math" w:cs="Cambria Math"/>
             </w:rPr>
             <m:t>=4700</m:t>
           </m:r>
@@ -1485,14 +1485,14 @@
               <m:degHide m:val="1"/>
               <m:ctrlPr>
                 <w:rPr>
-                  <w:rFonts w:ascii="Cambria Math" w:hAnsi="Cambria Math"/>
+                  <w:rFonts w:ascii="Cambria Math" w:eastAsia="Cambria Math" w:hAnsi="Cambria Math" w:cs="Cambria Math"/>
                 </w:rPr>
               </m:ctrlPr>
             </m:radPr>
             <m:deg>
               <m:ctrlPr>
                 <w:rPr>
-                  <w:rFonts w:ascii="Cambria Math" w:hAnsi="Cambria Math"/>
+                  <w:rFonts w:ascii="Cambria Math" w:eastAsia="Cambria Math" w:hAnsi="Cambria Math" w:cs="Cambria Math"/>
                   <w:i/>
                 </w:rPr>
               </m:ctrlPr>
@@ -1502,7 +1502,7 @@
                 <m:sSubSupPr>
                   <m:ctrlPr>
                     <w:rPr>
-                      <w:rFonts w:ascii="Cambria Math" w:hAnsi="Cambria Math"/>
+                      <w:rFonts w:ascii="Cambria Math" w:eastAsia="Cambria Math" w:hAnsi="Cambria Math" w:cs="Cambria Math"/>
                       <w:i/>
                     </w:rPr>
                   </m:ctrlPr>
@@ -1510,7 +1510,7 @@
                 <m:e>
                   <m:r>
                     <w:rPr>
-                      <w:rFonts w:ascii="Cambria Math" w:hAnsi="Cambria Math"/>
+                      <w:rFonts w:ascii="Cambria Math" w:eastAsia="Cambria Math" w:hAnsi="Cambria Math" w:cs="Cambria Math"/>
                     </w:rPr>
                     <m:t>f</m:t>
                   </m:r>
@@ -1518,7 +1518,7 @@
                 <m:sub>
                   <m:r>
                     <w:rPr>
-                      <w:rFonts w:ascii="Cambria Math" w:hAnsi="Cambria Math"/>
+                      <w:rFonts w:ascii="Cambria Math" w:eastAsia="Cambria Math" w:hAnsi="Cambria Math" w:cs="Cambria Math"/>
                     </w:rPr>
                     <m:t>c</m:t>
                   </m:r>
@@ -1526,7 +1526,7 @@
                 <m:sup>
                   <m:r>
                     <w:rPr>
-                      <w:rFonts w:ascii="Cambria Math" w:hAnsi="Cambria Math"/>
+                      <w:rFonts w:ascii="Cambria Math" w:eastAsia="Cambria Math" w:hAnsi="Cambria Math" w:cs="Cambria Math"/>
                     </w:rPr>
                     <m:t>'</m:t>
                   </m:r>
@@ -1535,26 +1535,20 @@
             </m:e>
           </m:rad>
           <m:r>
-            <w:rPr>
-              <w:rFonts w:ascii="Cambria Math" w:hAnsi="Cambria Math"/>
-            </w:rPr>
-            <m:t> </m:t>
-          </m:r>
-          <m:r>
             <m:rPr>
               <m:nor/>
             </m:rPr>
             <w:rPr>
-              <w:rFonts w:ascii="Cambria Math" w:hAnsi="Cambria Math"/>
+              <w:rFonts w:ascii="Cambria Math" w:eastAsia="Cambria Math" w:hAnsi="Cambria Math" w:cs="Cambria Math"/>
             </w:rPr>
-            <m:t>MPa</m:t>
+            <m:t xml:space="preserve"> MPa</m:t>
           </m:r>
           <m:r>
             <m:rPr>
               <m:sty m:val="p"/>
             </m:rPr>
             <w:rPr>
-              <w:rFonts w:ascii="Cambria Math" w:hAnsi="Cambria Math"/>
+              <w:rFonts w:ascii="Cambria Math" w:eastAsia="Cambria Math" w:hAnsi="Cambria Math" w:cs="Cambria Math"/>
             </w:rPr>
             <m:t> </m:t>
           </m:r>
@@ -1563,7 +1557,7 @@
               <m:nor/>
             </m:rPr>
             <w:rPr>
-              <w:rFonts w:ascii="Cambria Math" w:hAnsi="Cambria Math"/>
+              <w:rFonts w:ascii="Cambria Math" w:eastAsia="Cambria Math" w:hAnsi="Cambria Math" w:cs="Cambria Math"/>
             </w:rPr>
             <m:t>(Eq. 3)</m:t>
           </m:r>
@@ -1572,17 +1566,11 @@
     </w:p>
     <w:p>
       <w:pPr>
-        <w:spacing w:before="300" w:after="300"/>
-        <w:ind w:left="720" w:right="720"/>
-        <w:jc w:val="center"/>
-      </w:pPr>
-    </w:p>
-    <w:p>
-      <w:pPr>
-        <w:spacing w:after="200" w:line="360" w:lineRule="auto"/>
-        <w:jc w:val="both"/>
-      </w:pPr>
-      <w:r>
+        <w:spacing w:after="200" w:line="360" w:lineRule="auto"/>
+        <w:jc w:val="both"/>
+      </w:pPr>
+      <w:r>
+        <w:lastRenderedPageBreak/>
         <w:t>I selected this over the Eurocode alternative because ACI 318-19 has been more extensively validated for the concrete strengths I was studying (25-50 MPa), and the differences between the two approaches are small anyway, typically under 5 percent (MacGregor &amp; Wight, 2012).</w:t>
       </w:r>
     </w:p>
@@ -1625,7 +1613,7 @@
             <m:fPr>
               <m:ctrlPr>
                 <w:rPr>
-                  <w:rFonts w:ascii="Cambria Math" w:hAnsi="Cambria Math"/>
+                  <w:rFonts w:ascii="Cambria Math" w:eastAsia="Cambria Math" w:hAnsi="Cambria Math" w:cs="Cambria Math"/>
                 </w:rPr>
               </m:ctrlPr>
             </m:fPr>
@@ -1635,19 +1623,19 @@
                   <m:sty m:val="p"/>
                 </m:rPr>
                 <w:rPr>
-                  <w:rFonts w:ascii="Cambria Math" w:hAnsi="Cambria Math"/>
+                  <w:rFonts w:ascii="Cambria Math" w:eastAsia="Cambria Math" w:hAnsi="Cambria Math" w:cs="Cambria Math"/>
                 </w:rPr>
                 <m:t>Δ</m:t>
               </m:r>
               <m:r>
                 <w:rPr>
-                  <w:rFonts w:ascii="Cambria Math" w:hAnsi="Cambria Math"/>
+                  <w:rFonts w:ascii="Cambria Math" w:eastAsia="Cambria Math" w:hAnsi="Cambria Math" w:cs="Cambria Math"/>
                 </w:rPr>
                 <m:t>f</m:t>
               </m:r>
               <m:ctrlPr>
                 <w:rPr>
-                  <w:rFonts w:ascii="Cambria Math" w:hAnsi="Cambria Math"/>
+                  <w:rFonts w:ascii="Cambria Math" w:eastAsia="Cambria Math" w:hAnsi="Cambria Math" w:cs="Cambria Math"/>
                   <w:i/>
                 </w:rPr>
               </m:ctrlPr>
@@ -1655,13 +1643,13 @@
             <m:den>
               <m:r>
                 <w:rPr>
-                  <w:rFonts w:ascii="Cambria Math" w:hAnsi="Cambria Math"/>
+                  <w:rFonts w:ascii="Cambria Math" w:eastAsia="Cambria Math" w:hAnsi="Cambria Math" w:cs="Cambria Math"/>
                 </w:rPr>
                 <m:t>f</m:t>
               </m:r>
               <m:ctrlPr>
                 <w:rPr>
-                  <w:rFonts w:ascii="Cambria Math" w:hAnsi="Cambria Math"/>
+                  <w:rFonts w:ascii="Cambria Math" w:eastAsia="Cambria Math" w:hAnsi="Cambria Math" w:cs="Cambria Math"/>
                   <w:i/>
                 </w:rPr>
               </m:ctrlPr>
@@ -1672,7 +1660,7 @@
               <m:sty m:val="p"/>
             </m:rPr>
             <w:rPr>
-              <w:rFonts w:ascii="Cambria Math" w:hAnsi="Cambria Math"/>
+              <w:rFonts w:ascii="Cambria Math" w:eastAsia="Cambria Math" w:hAnsi="Cambria Math" w:cs="Cambria Math"/>
             </w:rPr>
             <m:t>≈</m:t>
           </m:r>
@@ -1680,20 +1668,20 @@
             <m:fPr>
               <m:ctrlPr>
                 <w:rPr>
-                  <w:rFonts w:ascii="Cambria Math" w:hAnsi="Cambria Math"/>
+                  <w:rFonts w:ascii="Cambria Math" w:eastAsia="Cambria Math" w:hAnsi="Cambria Math" w:cs="Cambria Math"/>
                 </w:rPr>
               </m:ctrlPr>
             </m:fPr>
             <m:num>
               <m:r>
                 <w:rPr>
-                  <w:rFonts w:ascii="Cambria Math" w:hAnsi="Cambria Math"/>
+                  <w:rFonts w:ascii="Cambria Math" w:eastAsia="Cambria Math" w:hAnsi="Cambria Math" w:cs="Cambria Math"/>
                 </w:rPr>
                 <m:t>1</m:t>
               </m:r>
               <m:ctrlPr>
                 <w:rPr>
-                  <w:rFonts w:ascii="Cambria Math" w:hAnsi="Cambria Math"/>
+                  <w:rFonts w:ascii="Cambria Math" w:eastAsia="Cambria Math" w:hAnsi="Cambria Math" w:cs="Cambria Math"/>
                   <w:i/>
                 </w:rPr>
               </m:ctrlPr>
@@ -1701,13 +1689,13 @@
             <m:den>
               <m:r>
                 <w:rPr>
-                  <w:rFonts w:ascii="Cambria Math" w:hAnsi="Cambria Math"/>
+                  <w:rFonts w:ascii="Cambria Math" w:eastAsia="Cambria Math" w:hAnsi="Cambria Math" w:cs="Cambria Math"/>
                 </w:rPr>
                 <m:t>2</m:t>
               </m:r>
               <m:ctrlPr>
                 <w:rPr>
-                  <w:rFonts w:ascii="Cambria Math" w:hAnsi="Cambria Math"/>
+                  <w:rFonts w:ascii="Cambria Math" w:eastAsia="Cambria Math" w:hAnsi="Cambria Math" w:cs="Cambria Math"/>
                   <w:i/>
                 </w:rPr>
               </m:ctrlPr>
@@ -1717,7 +1705,7 @@
             <m:fPr>
               <m:ctrlPr>
                 <w:rPr>
-                  <w:rFonts w:ascii="Cambria Math" w:hAnsi="Cambria Math"/>
+                  <w:rFonts w:ascii="Cambria Math" w:eastAsia="Cambria Math" w:hAnsi="Cambria Math" w:cs="Cambria Math"/>
                 </w:rPr>
               </m:ctrlPr>
             </m:fPr>
@@ -1727,19 +1715,19 @@
                   <m:sty m:val="p"/>
                 </m:rPr>
                 <w:rPr>
-                  <w:rFonts w:ascii="Cambria Math" w:hAnsi="Cambria Math"/>
+                  <w:rFonts w:ascii="Cambria Math" w:eastAsia="Cambria Math" w:hAnsi="Cambria Math" w:cs="Cambria Math"/>
                 </w:rPr>
                 <m:t>Δ</m:t>
               </m:r>
               <m:r>
                 <w:rPr>
-                  <w:rFonts w:ascii="Cambria Math" w:hAnsi="Cambria Math"/>
+                  <w:rFonts w:ascii="Cambria Math" w:eastAsia="Cambria Math" w:hAnsi="Cambria Math" w:cs="Cambria Math"/>
                 </w:rPr>
                 <m:t>K</m:t>
               </m:r>
               <m:ctrlPr>
                 <w:rPr>
-                  <w:rFonts w:ascii="Cambria Math" w:hAnsi="Cambria Math"/>
+                  <w:rFonts w:ascii="Cambria Math" w:eastAsia="Cambria Math" w:hAnsi="Cambria Math" w:cs="Cambria Math"/>
                   <w:i/>
                 </w:rPr>
               </m:ctrlPr>
@@ -1747,13 +1735,13 @@
             <m:den>
               <m:r>
                 <w:rPr>
-                  <w:rFonts w:ascii="Cambria Math" w:hAnsi="Cambria Math"/>
+                  <w:rFonts w:ascii="Cambria Math" w:eastAsia="Cambria Math" w:hAnsi="Cambria Math" w:cs="Cambria Math"/>
                 </w:rPr>
                 <m:t>K</m:t>
               </m:r>
               <m:ctrlPr>
                 <w:rPr>
-                  <w:rFonts w:ascii="Cambria Math" w:hAnsi="Cambria Math"/>
+                  <w:rFonts w:ascii="Cambria Math" w:eastAsia="Cambria Math" w:hAnsi="Cambria Math" w:cs="Cambria Math"/>
                   <w:i/>
                 </w:rPr>
               </m:ctrlPr>
@@ -1764,7 +1752,7 @@
               <m:sty m:val="p"/>
             </m:rPr>
             <w:rPr>
-              <w:rFonts w:ascii="Cambria Math" w:hAnsi="Cambria Math"/>
+              <w:rFonts w:ascii="Cambria Math" w:eastAsia="Cambria Math" w:hAnsi="Cambria Math" w:cs="Cambria Math"/>
             </w:rPr>
             <m:t> </m:t>
           </m:r>
@@ -1773,7 +1761,7 @@
               <m:nor/>
             </m:rPr>
             <w:rPr>
-              <w:rFonts w:ascii="Cambria Math" w:hAnsi="Cambria Math"/>
+              <w:rFonts w:ascii="Cambria Math" w:eastAsia="Cambria Math" w:hAnsi="Cambria Math" w:cs="Cambria Math"/>
             </w:rPr>
             <m:t>(Eq. 4)</m:t>
           </m:r>
@@ -1784,6 +1772,7 @@
       <w:pPr>
         <w:spacing w:before="300" w:after="300"/>
         <w:ind w:left="720" w:right="720"/>
+        <w:jc w:val="center"/>
       </w:pPr>
     </w:p>
     <w:p>
@@ -1987,12 +1976,6 @@
     </w:p>
     <w:p>
       <w:pPr>
-        <w:spacing w:before="300" w:after="300"/>
-        <w:ind w:right="720"/>
-      </w:pPr>
-    </w:p>
-    <w:p>
-      <w:pPr>
         <w:spacing w:after="200" w:line="360" w:lineRule="auto"/>
         <w:jc w:val="both"/>
       </w:pPr>
@@ -2033,7 +2016,6 @@
         <w:jc w:val="both"/>
       </w:pPr>
       <w:r>
-        <w:lastRenderedPageBreak/>
         <w:t>For the RC beams in my study, with length-to-depth ratios ranging from about 4.3 to 26.7, Euler-Bernoulli theory is appropriate for most configurations. Only the deepest sections might benefit from Timoshenko refinement.</w:t>
       </w:r>
     </w:p>
@@ -2043,6 +2025,7 @@
         <w:spacing w:before="400" w:after="200" w:line="360" w:lineRule="auto"/>
       </w:pPr>
       <w:r>
+        <w:lastRenderedPageBreak/>
         <w:t>2.3.3 FEM Validation Studies in Literature</w:t>
       </w:r>
     </w:p>
@@ -2223,7 +2206,6 @@
                 <w:sz w:val="22"/>
                 <w:szCs w:val="22"/>
               </w:rPr>
-              <w:lastRenderedPageBreak/>
               <w:t>Support Vector Machine (Puk kernel)</w:t>
             </w:r>
           </w:p>
@@ -2379,6 +2361,7 @@
         <w:jc w:val="both"/>
       </w:pPr>
       <w:r>
+        <w:lastRenderedPageBreak/>
         <w:t>Key findings included that ensemble methods like Random Forest and kernel-based methods like SVM outperformed single-model approaches. Prediction accuracy varied with boundary conditions and thickness ratios.</w:t>
       </w:r>
     </w:p>
@@ -2460,19 +2443,16 @@
         <w:jc w:val="both"/>
       </w:pPr>
       <w:r>
-        <w:t xml:space="preserve">CatBoost (Prokhorenkova et al., 2018) addresses prediction shift problems in gradient boosting through ordered boosting and handles categorical features natively. While less commonly </w:t>
-      </w:r>
+        <w:t>CatBoost (Prokhorenkova et al., 2018) addresses prediction shift problems in gradient boosting through ordered boosting and handles categorical features natively. While less commonly applied in structural engineering than the others, its handling of mixed feature types made it potentially suitable for my damage classification problem.</w:t>
+      </w:r>
+    </w:p>
+    <w:p>
+      <w:pPr>
+        <w:spacing w:after="200" w:line="360" w:lineRule="auto"/>
+        <w:jc w:val="both"/>
+      </w:pPr>
       <w:r>
         <w:lastRenderedPageBreak/>
-        <w:t>applied in structural engineering than the others, its handling of mixed feature types made it potentially suitable for my damage classification problem.</w:t>
-      </w:r>
-    </w:p>
-    <w:p>
-      <w:pPr>
-        <w:spacing w:after="200" w:line="360" w:lineRule="auto"/>
-        <w:jc w:val="both"/>
-      </w:pPr>
-      <w:r>
         <w:t>Support Vector Regression (Cortes &amp; Vapnik, 1995) uses kernel functions to map inputs to higher-dimensional spaces. Laory et al. (2018) found SVR with RBF kernel among the best performers for bridge frequency prediction.</w:t>
       </w:r>
     </w:p>
@@ -2761,7 +2741,7 @@
         <m:oMath>
           <m:r>
             <w:rPr>
-              <w:rFonts w:ascii="Cambria Math" w:hAnsi="Cambria Math"/>
+              <w:rFonts w:ascii="Cambria Math" w:eastAsia="Cambria Math" w:hAnsi="Cambria Math" w:cs="Cambria Math"/>
             </w:rPr>
             <m:t>E</m:t>
           </m:r>
@@ -2769,7 +2749,7 @@
             <m:sSubPr>
               <m:ctrlPr>
                 <w:rPr>
-                  <w:rFonts w:ascii="Cambria Math" w:hAnsi="Cambria Math"/>
+                  <w:rFonts w:ascii="Cambria Math" w:eastAsia="Cambria Math" w:hAnsi="Cambria Math" w:cs="Cambria Math"/>
                   <w:i/>
                 </w:rPr>
               </m:ctrlPr>
@@ -2777,7 +2757,7 @@
             <m:e>
               <m:r>
                 <w:rPr>
-                  <w:rFonts w:ascii="Cambria Math" w:hAnsi="Cambria Math"/>
+                  <w:rFonts w:ascii="Cambria Math" w:eastAsia="Cambria Math" w:hAnsi="Cambria Math" w:cs="Cambria Math"/>
                 </w:rPr>
                 <m:t>I</m:t>
               </m:r>
@@ -2788,7 +2768,7 @@
                   <m:nor/>
                 </m:rPr>
                 <w:rPr>
-                  <w:rFonts w:ascii="Cambria Math" w:hAnsi="Cambria Math"/>
+                  <w:rFonts w:ascii="Cambria Math" w:eastAsia="Cambria Math" w:hAnsi="Cambria Math" w:cs="Cambria Math"/>
                 </w:rPr>
                 <m:t>damaged</m:t>
               </m:r>
@@ -2796,7 +2776,7 @@
           </m:sSub>
           <m:r>
             <w:rPr>
-              <w:rFonts w:ascii="Cambria Math" w:hAnsi="Cambria Math"/>
+              <w:rFonts w:ascii="Cambria Math" w:eastAsia="Cambria Math" w:hAnsi="Cambria Math" w:cs="Cambria Math"/>
             </w:rPr>
             <m:t>=E</m:t>
           </m:r>
@@ -2804,7 +2784,7 @@
             <m:sSubPr>
               <m:ctrlPr>
                 <w:rPr>
-                  <w:rFonts w:ascii="Cambria Math" w:hAnsi="Cambria Math"/>
+                  <w:rFonts w:ascii="Cambria Math" w:eastAsia="Cambria Math" w:hAnsi="Cambria Math" w:cs="Cambria Math"/>
                   <w:i/>
                 </w:rPr>
               </m:ctrlPr>
@@ -2812,7 +2792,7 @@
             <m:e>
               <m:r>
                 <w:rPr>
-                  <w:rFonts w:ascii="Cambria Math" w:hAnsi="Cambria Math"/>
+                  <w:rFonts w:ascii="Cambria Math" w:eastAsia="Cambria Math" w:hAnsi="Cambria Math" w:cs="Cambria Math"/>
                 </w:rPr>
                 <m:t>I</m:t>
               </m:r>
@@ -2823,7 +2803,7 @@
                   <m:nor/>
                 </m:rPr>
                 <w:rPr>
-                  <w:rFonts w:ascii="Cambria Math" w:hAnsi="Cambria Math"/>
+                  <w:rFonts w:ascii="Cambria Math" w:eastAsia="Cambria Math" w:hAnsi="Cambria Math" w:cs="Cambria Math"/>
                 </w:rPr>
                 <m:t>original</m:t>
               </m:r>
@@ -2834,7 +2814,7 @@
               <m:sty m:val="p"/>
             </m:rPr>
             <w:rPr>
-              <w:rFonts w:ascii="Cambria Math" w:hAnsi="Cambria Math"/>
+              <w:rFonts w:ascii="Cambria Math" w:eastAsia="Cambria Math" w:hAnsi="Cambria Math" w:cs="Cambria Math"/>
             </w:rPr>
             <m:t>×</m:t>
           </m:r>
@@ -2842,7 +2822,7 @@
             <m:dPr>
               <m:ctrlPr>
                 <w:rPr>
-                  <w:rFonts w:ascii="Cambria Math" w:hAnsi="Cambria Math"/>
+                  <w:rFonts w:ascii="Cambria Math" w:eastAsia="Cambria Math" w:hAnsi="Cambria Math" w:cs="Cambria Math"/>
                   <w:i/>
                 </w:rPr>
               </m:ctrlPr>
@@ -2850,7 +2830,7 @@
             <m:e>
               <m:r>
                 <w:rPr>
-                  <w:rFonts w:ascii="Cambria Math" w:hAnsi="Cambria Math"/>
+                  <w:rFonts w:ascii="Cambria Math" w:eastAsia="Cambria Math" w:hAnsi="Cambria Math" w:cs="Cambria Math"/>
                 </w:rPr>
                 <m:t>1-</m:t>
               </m:r>
@@ -2859,7 +2839,7 @@
                   <m:sty m:val="p"/>
                 </m:rPr>
                 <w:rPr>
-                  <w:rFonts w:ascii="Cambria Math" w:hAnsi="Cambria Math"/>
+                  <w:rFonts w:ascii="Cambria Math" w:eastAsia="Cambria Math" w:hAnsi="Cambria Math" w:cs="Cambria Math"/>
                 </w:rPr>
                 <m:t>α</m:t>
               </m:r>
@@ -2870,7 +2850,7 @@
               <m:sty m:val="p"/>
             </m:rPr>
             <w:rPr>
-              <w:rFonts w:ascii="Cambria Math" w:hAnsi="Cambria Math"/>
+              <w:rFonts w:ascii="Cambria Math" w:eastAsia="Cambria Math" w:hAnsi="Cambria Math" w:cs="Cambria Math"/>
             </w:rPr>
             <m:t> </m:t>
           </m:r>
@@ -2879,7 +2859,7 @@
               <m:nor/>
             </m:rPr>
             <w:rPr>
-              <w:rFonts w:ascii="Cambria Math" w:hAnsi="Cambria Math"/>
+              <w:rFonts w:ascii="Cambria Math" w:eastAsia="Cambria Math" w:hAnsi="Cambria Math" w:cs="Cambria Math"/>
             </w:rPr>
             <m:t>(Eq. 6)</m:t>
           </m:r>
@@ -2899,11 +2879,7 @@
         <w:jc w:val="both"/>
       </w:pPr>
       <w:r>
-        <w:t xml:space="preserve">where alpha is the damage factor. This approach has been validated against experimental studies of corroded RC beams (Rodriguez et al., 1997; Cairns et al., 2005). A multiplier of 1.6 </w:t>
-      </w:r>
-      <w:r>
-        <w:lastRenderedPageBreak/>
-        <w:t>is typically applied to corrosion percentage to estimate effective stiffness loss, reflecting the accelerated degradation beyond simple area reduction.</w:t>
+        <w:t>where alpha is the damage factor. This approach has been validated against experimental studies of corroded RC beams (Rodriguez et al., 1997; Cairns et al., 2005). A multiplier of 1.6 is typically applied to corrosion percentage to estimate effective stiffness loss, reflecting the accelerated degradation beyond simple area reduction.</w:t>
       </w:r>
     </w:p>
     <w:p>
@@ -2921,6 +2897,7 @@
         <w:jc w:val="both"/>
       </w:pPr>
       <w:r>
+        <w:lastRenderedPageBreak/>
         <w:t>Localized damage like cracks can be modeled several ways: local stiffness reduction at the crack location, rotational spring models with reduced stiffness, or smeared crack approaches that distribute stiffness reduction over a zone. Dimarogonas (1996) and Chondros et al. (1998) developed theoretical frameworks for vibration of cracked structures that have been widely adopted.</w:t>
       </w:r>
     </w:p>
@@ -3396,8 +3373,8 @@
           <w:noProof/>
         </w:rPr>
         <w:drawing>
-          <wp:inline distT="0" distB="0" distL="0" distR="0" wp14:anchorId="64B7614D" wp14:editId="3A1438B4">
-            <wp:extent cx="5376055" cy="6570733"/>
+          <wp:inline distT="0" distB="0" distL="0" distR="0" wp14:anchorId="7D2FA86F" wp14:editId="285DA848">
+            <wp:extent cx="4286250" cy="5238750"/>
             <wp:effectExtent l="0" t="0" r="0" b="0"/>
             <wp:docPr id="1" name="Picture 1"/>
             <wp:cNvGraphicFramePr>
@@ -3422,7 +3399,7 @@
                   <pic:spPr bwMode="auto">
                     <a:xfrm>
                       <a:off x="0" y="0"/>
-                      <a:ext cx="5428215" cy="6634484"/>
+                      <a:ext cx="4286250" cy="5238750"/>
                     </a:xfrm>
                     <a:prstGeom prst="rect">
                       <a:avLst/>
@@ -3457,7 +3434,6 @@
         <w:jc w:val="both"/>
       </w:pPr>
       <w:r>
-        <w:lastRenderedPageBreak/>
         <w:t>The workflow integrates literature findings from Chapter 2 with finite element simulations and machine learning analysis, following established practices demonstrated by Das (2023) and Saha and Yang (2023).</w:t>
       </w:r>
     </w:p>
@@ -3467,6 +3443,7 @@
         <w:spacing w:before="400" w:after="200" w:line="360" w:lineRule="auto"/>
       </w:pPr>
       <w:r>
+        <w:lastRenderedPageBreak/>
         <w:t>3.2 Introduction</w:t>
       </w:r>
     </w:p>
@@ -3557,16 +3534,16 @@
         <w:jc w:val="both"/>
       </w:pPr>
       <w:r>
+        <w:t>This approach ensures internal validity by strictly controlling input parameters and external validity by covering a wide range of geometric and material properties typical of real structures. The scope is limited to fixed-fixed RC beams, considering uniform corrosion and localized cracking as primary damage mechanisms.</w:t>
+      </w:r>
+    </w:p>
+    <w:p>
+      <w:pPr>
+        <w:spacing w:after="200" w:line="360" w:lineRule="auto"/>
+        <w:jc w:val="both"/>
+      </w:pPr>
+      <w:r>
         <w:lastRenderedPageBreak/>
-        <w:t>This approach ensures internal validity by strictly controlling input parameters and external validity by covering a wide range of geometric and material properties typical of real structures. The scope is limited to fixed-fixed RC beams, considering uniform corrosion and localized cracking as primary damage mechanisms.</w:t>
-      </w:r>
-    </w:p>
-    <w:p>
-      <w:pPr>
-        <w:spacing w:after="200" w:line="360" w:lineRule="auto"/>
-        <w:jc w:val="both"/>
-      </w:pPr>
-      <w:r>
         <w:t>I determined the sample size of 3,000 simulations following power analysis guidelines for regression studies (Cohen, 1992). Latin Hypercube Sampling was selected over simple random sampling because of its superior space-filling properties (McKay et al., 1979).</w:t>
       </w:r>
     </w:p>
@@ -3611,7 +3588,7 @@
               <m:endChr m:val="]"/>
               <m:ctrlPr>
                 <w:rPr>
-                  <w:rFonts w:ascii="Cambria Math" w:hAnsi="Cambria Math"/>
+                  <w:rFonts w:ascii="Cambria Math" w:eastAsia="Cambria Math" w:hAnsi="Cambria Math" w:cs="Cambria Math"/>
                   <w:i/>
                 </w:rPr>
               </m:ctrlPr>
@@ -3619,31 +3596,58 @@
             <m:e>
               <m:r>
                 <w:rPr>
-                  <w:rFonts w:ascii="Cambria Math" w:hAnsi="Cambria Math"/>
+                  <w:rFonts w:ascii="Cambria Math" w:eastAsia="Cambria Math" w:hAnsi="Cambria Math" w:cs="Cambria Math"/>
                 </w:rPr>
                 <m:t>K</m:t>
               </m:r>
             </m:e>
           </m:d>
           <m:r>
+            <m:rPr>
+              <m:lit/>
+            </m:rPr>
             <w:rPr>
-              <w:rFonts w:ascii="Cambria Math" w:hAnsi="Cambria Math"/>
+              <w:rFonts w:ascii="Cambria Math" w:eastAsia="Cambria Math" w:hAnsi="Cambria Math" w:cs="Cambria Math"/>
             </w:rPr>
-            <m:t>u=</m:t>
+            <m:t>{</m:t>
+          </m:r>
+          <m:r>
+            <w:rPr>
+              <w:rFonts w:ascii="Cambria Math" w:eastAsia="Cambria Math" w:hAnsi="Cambria Math" w:cs="Cambria Math"/>
+            </w:rPr>
+            <m:t>u</m:t>
+          </m:r>
+          <m:r>
+            <m:rPr>
+              <m:lit/>
+            </m:rPr>
+            <w:rPr>
+              <w:rFonts w:ascii="Cambria Math" w:eastAsia="Cambria Math" w:hAnsi="Cambria Math" w:cs="Cambria Math"/>
+            </w:rPr>
+            <m:t>}</m:t>
+          </m:r>
+          <m:r>
+            <w:rPr>
+              <w:rFonts w:ascii="Cambria Math" w:eastAsia="Cambria Math" w:hAnsi="Cambria Math" w:cs="Cambria Math"/>
+            </w:rPr>
+            <m:t>=</m:t>
           </m:r>
           <m:sSup>
             <m:sSupPr>
               <m:ctrlPr>
                 <w:rPr>
-                  <w:rFonts w:ascii="Cambria Math" w:hAnsi="Cambria Math"/>
+                  <w:rFonts w:ascii="Cambria Math" w:eastAsia="Cambria Math" w:hAnsi="Cambria Math" w:cs="Cambria Math"/>
                   <w:i/>
                 </w:rPr>
               </m:ctrlPr>
             </m:sSupPr>
             <m:e>
               <m:r>
+                <m:rPr>
+                  <m:sty m:val="p"/>
+                </m:rPr>
                 <w:rPr>
-                  <w:rFonts w:ascii="Cambria Math" w:hAnsi="Cambria Math"/>
+                  <w:rFonts w:ascii="Cambria Math" w:eastAsia="Cambria Math" w:hAnsi="Cambria Math" w:cs="Cambria Math"/>
                 </w:rPr>
                 <m:t>ω</m:t>
               </m:r>
@@ -3651,7 +3655,7 @@
             <m:sup>
               <m:r>
                 <w:rPr>
-                  <w:rFonts w:ascii="Cambria Math" w:hAnsi="Cambria Math"/>
+                  <w:rFonts w:ascii="Cambria Math" w:eastAsia="Cambria Math" w:hAnsi="Cambria Math" w:cs="Cambria Math"/>
                 </w:rPr>
                 <m:t>2</m:t>
               </m:r>
@@ -3663,7 +3667,7 @@
               <m:endChr m:val="]"/>
               <m:ctrlPr>
                 <w:rPr>
-                  <w:rFonts w:ascii="Cambria Math" w:hAnsi="Cambria Math"/>
+                  <w:rFonts w:ascii="Cambria Math" w:eastAsia="Cambria Math" w:hAnsi="Cambria Math" w:cs="Cambria Math"/>
                   <w:i/>
                 </w:rPr>
               </m:ctrlPr>
@@ -3671,24 +3675,42 @@
             <m:e>
               <m:r>
                 <w:rPr>
-                  <w:rFonts w:ascii="Cambria Math" w:hAnsi="Cambria Math"/>
+                  <w:rFonts w:ascii="Cambria Math" w:eastAsia="Cambria Math" w:hAnsi="Cambria Math" w:cs="Cambria Math"/>
                 </w:rPr>
                 <m:t>M</m:t>
               </m:r>
             </m:e>
           </m:d>
           <m:r>
+            <m:rPr>
+              <m:lit/>
+            </m:rPr>
             <w:rPr>
-              <w:rFonts w:ascii="Cambria Math" w:hAnsi="Cambria Math"/>
+              <w:rFonts w:ascii="Cambria Math" w:eastAsia="Cambria Math" w:hAnsi="Cambria Math" w:cs="Cambria Math"/>
+            </w:rPr>
+            <m:t>{</m:t>
+          </m:r>
+          <m:r>
+            <w:rPr>
+              <w:rFonts w:ascii="Cambria Math" w:eastAsia="Cambria Math" w:hAnsi="Cambria Math" w:cs="Cambria Math"/>
             </w:rPr>
             <m:t>u</m:t>
+          </m:r>
+          <m:r>
+            <m:rPr>
+              <m:lit/>
+            </m:rPr>
+            <w:rPr>
+              <w:rFonts w:ascii="Cambria Math" w:eastAsia="Cambria Math" w:hAnsi="Cambria Math" w:cs="Cambria Math"/>
+            </w:rPr>
+            <m:t>}</m:t>
           </m:r>
           <m:r>
             <m:rPr>
               <m:sty m:val="p"/>
             </m:rPr>
             <w:rPr>
-              <w:rFonts w:ascii="Cambria Math" w:hAnsi="Cambria Math"/>
+              <w:rFonts w:ascii="Cambria Math" w:eastAsia="Cambria Math" w:hAnsi="Cambria Math" w:cs="Cambria Math"/>
             </w:rPr>
             <m:t> </m:t>
           </m:r>
@@ -3697,7 +3719,7 @@
               <m:nor/>
             </m:rPr>
             <w:rPr>
-              <w:rFonts w:ascii="Cambria Math" w:hAnsi="Cambria Math"/>
+              <w:rFonts w:ascii="Cambria Math" w:eastAsia="Cambria Math" w:hAnsi="Cambria Math" w:cs="Cambria Math"/>
             </w:rPr>
             <m:t>(Eq. 5)</m:t>
           </m:r>
@@ -3739,7 +3761,7 @@
         <m:oMath>
           <m:r>
             <w:rPr>
-              <w:rFonts w:ascii="Cambria Math" w:hAnsi="Cambria Math"/>
+              <w:rFonts w:ascii="Cambria Math" w:eastAsia="Cambria Math" w:hAnsi="Cambria Math" w:cs="Cambria Math"/>
             </w:rPr>
             <m:t>f=</m:t>
           </m:r>
@@ -3747,7 +3769,7 @@
             <m:fPr>
               <m:ctrlPr>
                 <w:rPr>
-                  <w:rFonts w:ascii="Cambria Math" w:hAnsi="Cambria Math"/>
+                  <w:rFonts w:ascii="Cambria Math" w:eastAsia="Cambria Math" w:hAnsi="Cambria Math" w:cs="Cambria Math"/>
                 </w:rPr>
               </m:ctrlPr>
             </m:fPr>
@@ -3757,13 +3779,13 @@
                   <m:sty m:val="p"/>
                 </m:rPr>
                 <w:rPr>
-                  <w:rFonts w:ascii="Cambria Math" w:hAnsi="Cambria Math"/>
+                  <w:rFonts w:ascii="Cambria Math" w:eastAsia="Cambria Math" w:hAnsi="Cambria Math" w:cs="Cambria Math"/>
                 </w:rPr>
                 <m:t>ω</m:t>
               </m:r>
               <m:ctrlPr>
                 <w:rPr>
-                  <w:rFonts w:ascii="Cambria Math" w:hAnsi="Cambria Math"/>
+                  <w:rFonts w:ascii="Cambria Math" w:eastAsia="Cambria Math" w:hAnsi="Cambria Math" w:cs="Cambria Math"/>
                   <w:i/>
                 </w:rPr>
               </m:ctrlPr>
@@ -3771,7 +3793,7 @@
             <m:den>
               <m:r>
                 <w:rPr>
-                  <w:rFonts w:ascii="Cambria Math" w:hAnsi="Cambria Math"/>
+                  <w:rFonts w:ascii="Cambria Math" w:eastAsia="Cambria Math" w:hAnsi="Cambria Math" w:cs="Cambria Math"/>
                 </w:rPr>
                 <m:t>2</m:t>
               </m:r>
@@ -3780,13 +3802,13 @@
                   <m:sty m:val="p"/>
                 </m:rPr>
                 <w:rPr>
-                  <w:rFonts w:ascii="Cambria Math" w:hAnsi="Cambria Math"/>
+                  <w:rFonts w:ascii="Cambria Math" w:eastAsia="Cambria Math" w:hAnsi="Cambria Math" w:cs="Cambria Math"/>
                 </w:rPr>
                 <m:t>π</m:t>
               </m:r>
               <m:ctrlPr>
                 <w:rPr>
-                  <w:rFonts w:ascii="Cambria Math" w:hAnsi="Cambria Math"/>
+                  <w:rFonts w:ascii="Cambria Math" w:eastAsia="Cambria Math" w:hAnsi="Cambria Math" w:cs="Cambria Math"/>
                   <w:i/>
                 </w:rPr>
               </m:ctrlPr>
@@ -3794,7 +3816,7 @@
           </m:f>
           <m:r>
             <w:rPr>
-              <w:rFonts w:ascii="Cambria Math" w:hAnsi="Cambria Math"/>
+              <w:rFonts w:ascii="Cambria Math" w:eastAsia="Cambria Math" w:hAnsi="Cambria Math" w:cs="Cambria Math"/>
             </w:rPr>
             <m:t>=</m:t>
           </m:r>
@@ -3802,7 +3824,7 @@
             <m:fPr>
               <m:ctrlPr>
                 <w:rPr>
-                  <w:rFonts w:ascii="Cambria Math" w:hAnsi="Cambria Math"/>
+                  <w:rFonts w:ascii="Cambria Math" w:eastAsia="Cambria Math" w:hAnsi="Cambria Math" w:cs="Cambria Math"/>
                 </w:rPr>
               </m:ctrlPr>
             </m:fPr>
@@ -3812,7 +3834,7 @@
                   <m:degHide m:val="1"/>
                   <m:ctrlPr>
                     <w:rPr>
-                      <w:rFonts w:ascii="Cambria Math" w:hAnsi="Cambria Math"/>
+                      <w:rFonts w:ascii="Cambria Math" w:eastAsia="Cambria Math" w:hAnsi="Cambria Math" w:cs="Cambria Math"/>
                     </w:rPr>
                   </m:ctrlPr>
                 </m:radPr>
@@ -3823,7 +3845,7 @@
                       <m:sty m:val="p"/>
                     </m:rPr>
                     <w:rPr>
-                      <w:rFonts w:ascii="Cambria Math" w:hAnsi="Cambria Math"/>
+                      <w:rFonts w:ascii="Cambria Math" w:eastAsia="Cambria Math" w:hAnsi="Cambria Math" w:cs="Cambria Math"/>
                     </w:rPr>
                     <m:t>λ</m:t>
                   </m:r>
@@ -3831,7 +3853,7 @@
               </m:rad>
               <m:ctrlPr>
                 <w:rPr>
-                  <w:rFonts w:ascii="Cambria Math" w:hAnsi="Cambria Math"/>
+                  <w:rFonts w:ascii="Cambria Math" w:eastAsia="Cambria Math" w:hAnsi="Cambria Math" w:cs="Cambria Math"/>
                   <w:i/>
                 </w:rPr>
               </m:ctrlPr>
@@ -3839,7 +3861,7 @@
             <m:den>
               <m:r>
                 <w:rPr>
-                  <w:rFonts w:ascii="Cambria Math" w:hAnsi="Cambria Math"/>
+                  <w:rFonts w:ascii="Cambria Math" w:eastAsia="Cambria Math" w:hAnsi="Cambria Math" w:cs="Cambria Math"/>
                 </w:rPr>
                 <m:t>2</m:t>
               </m:r>
@@ -3848,13 +3870,13 @@
                   <m:sty m:val="p"/>
                 </m:rPr>
                 <w:rPr>
-                  <w:rFonts w:ascii="Cambria Math" w:hAnsi="Cambria Math"/>
+                  <w:rFonts w:ascii="Cambria Math" w:eastAsia="Cambria Math" w:hAnsi="Cambria Math" w:cs="Cambria Math"/>
                 </w:rPr>
                 <m:t>π</m:t>
               </m:r>
               <m:ctrlPr>
                 <w:rPr>
-                  <w:rFonts w:ascii="Cambria Math" w:hAnsi="Cambria Math"/>
+                  <w:rFonts w:ascii="Cambria Math" w:eastAsia="Cambria Math" w:hAnsi="Cambria Math" w:cs="Cambria Math"/>
                   <w:i/>
                 </w:rPr>
               </m:ctrlPr>
@@ -3865,7 +3887,7 @@
               <m:sty m:val="p"/>
             </m:rPr>
             <w:rPr>
-              <w:rFonts w:ascii="Cambria Math" w:hAnsi="Cambria Math"/>
+              <w:rFonts w:ascii="Cambria Math" w:eastAsia="Cambria Math" w:hAnsi="Cambria Math" w:cs="Cambria Math"/>
             </w:rPr>
             <m:t> </m:t>
           </m:r>
@@ -3874,7 +3896,7 @@
               <m:nor/>
             </m:rPr>
             <w:rPr>
-              <w:rFonts w:ascii="Cambria Math" w:hAnsi="Cambria Math"/>
+              <w:rFonts w:ascii="Cambria Math" w:eastAsia="Cambria Math" w:hAnsi="Cambria Math" w:cs="Cambria Math"/>
             </w:rPr>
             <m:t>(Eq. 7)</m:t>
           </m:r>
@@ -3927,7 +3949,7 @@
             <m:sSubPr>
               <m:ctrlPr>
                 <w:rPr>
-                  <w:rFonts w:ascii="Cambria Math" w:hAnsi="Cambria Math"/>
+                  <w:rFonts w:ascii="Cambria Math" w:eastAsia="Cambria Math" w:hAnsi="Cambria Math" w:cs="Cambria Math"/>
                   <w:i/>
                 </w:rPr>
               </m:ctrlPr>
@@ -3935,7 +3957,7 @@
             <m:e>
               <m:r>
                 <w:rPr>
-                  <w:rFonts w:ascii="Cambria Math" w:hAnsi="Cambria Math"/>
+                  <w:rFonts w:ascii="Cambria Math" w:eastAsia="Cambria Math" w:hAnsi="Cambria Math" w:cs="Cambria Math"/>
                 </w:rPr>
                 <m:t>E</m:t>
               </m:r>
@@ -3943,7 +3965,7 @@
             <m:sub>
               <m:r>
                 <w:rPr>
-                  <w:rFonts w:ascii="Cambria Math" w:hAnsi="Cambria Math"/>
+                  <w:rFonts w:ascii="Cambria Math" w:eastAsia="Cambria Math" w:hAnsi="Cambria Math" w:cs="Cambria Math"/>
                 </w:rPr>
                 <m:t>c</m:t>
               </m:r>
@@ -3951,7 +3973,7 @@
           </m:sSub>
           <m:r>
             <w:rPr>
-              <w:rFonts w:ascii="Cambria Math" w:hAnsi="Cambria Math"/>
+              <w:rFonts w:ascii="Cambria Math" w:eastAsia="Cambria Math" w:hAnsi="Cambria Math" w:cs="Cambria Math"/>
             </w:rPr>
             <m:t>=4700</m:t>
           </m:r>
@@ -3960,14 +3982,14 @@
               <m:degHide m:val="1"/>
               <m:ctrlPr>
                 <w:rPr>
-                  <w:rFonts w:ascii="Cambria Math" w:hAnsi="Cambria Math"/>
+                  <w:rFonts w:ascii="Cambria Math" w:eastAsia="Cambria Math" w:hAnsi="Cambria Math" w:cs="Cambria Math"/>
                 </w:rPr>
               </m:ctrlPr>
             </m:radPr>
             <m:deg>
               <m:ctrlPr>
                 <w:rPr>
-                  <w:rFonts w:ascii="Cambria Math" w:hAnsi="Cambria Math"/>
+                  <w:rFonts w:ascii="Cambria Math" w:eastAsia="Cambria Math" w:hAnsi="Cambria Math" w:cs="Cambria Math"/>
                   <w:i/>
                 </w:rPr>
               </m:ctrlPr>
@@ -3977,7 +3999,7 @@
                 <m:sSubSupPr>
                   <m:ctrlPr>
                     <w:rPr>
-                      <w:rFonts w:ascii="Cambria Math" w:hAnsi="Cambria Math"/>
+                      <w:rFonts w:ascii="Cambria Math" w:eastAsia="Cambria Math" w:hAnsi="Cambria Math" w:cs="Cambria Math"/>
                       <w:i/>
                     </w:rPr>
                   </m:ctrlPr>
@@ -3985,7 +4007,7 @@
                 <m:e>
                   <m:r>
                     <w:rPr>
-                      <w:rFonts w:ascii="Cambria Math" w:hAnsi="Cambria Math"/>
+                      <w:rFonts w:ascii="Cambria Math" w:eastAsia="Cambria Math" w:hAnsi="Cambria Math" w:cs="Cambria Math"/>
                     </w:rPr>
                     <m:t>f</m:t>
                   </m:r>
@@ -3993,7 +4015,7 @@
                 <m:sub>
                   <m:r>
                     <w:rPr>
-                      <w:rFonts w:ascii="Cambria Math" w:hAnsi="Cambria Math"/>
+                      <w:rFonts w:ascii="Cambria Math" w:eastAsia="Cambria Math" w:hAnsi="Cambria Math" w:cs="Cambria Math"/>
                     </w:rPr>
                     <m:t>c</m:t>
                   </m:r>
@@ -4001,7 +4023,7 @@
                 <m:sup>
                   <m:r>
                     <w:rPr>
-                      <w:rFonts w:ascii="Cambria Math" w:hAnsi="Cambria Math"/>
+                      <w:rFonts w:ascii="Cambria Math" w:eastAsia="Cambria Math" w:hAnsi="Cambria Math" w:cs="Cambria Math"/>
                     </w:rPr>
                     <m:t>'</m:t>
                   </m:r>
@@ -4010,26 +4032,20 @@
             </m:e>
           </m:rad>
           <m:r>
-            <w:rPr>
-              <w:rFonts w:ascii="Cambria Math" w:hAnsi="Cambria Math"/>
-            </w:rPr>
-            <m:t> </m:t>
-          </m:r>
-          <m:r>
             <m:rPr>
               <m:nor/>
             </m:rPr>
             <w:rPr>
-              <w:rFonts w:ascii="Cambria Math" w:hAnsi="Cambria Math"/>
+              <w:rFonts w:ascii="Cambria Math" w:eastAsia="Cambria Math" w:hAnsi="Cambria Math" w:cs="Cambria Math"/>
             </w:rPr>
-            <m:t>MPa</m:t>
+            <m:t xml:space="preserve"> MPa</m:t>
           </m:r>
           <m:r>
             <m:rPr>
               <m:sty m:val="p"/>
             </m:rPr>
             <w:rPr>
-              <w:rFonts w:ascii="Cambria Math" w:hAnsi="Cambria Math"/>
+              <w:rFonts w:ascii="Cambria Math" w:eastAsia="Cambria Math" w:hAnsi="Cambria Math" w:cs="Cambria Math"/>
             </w:rPr>
             <m:t> </m:t>
           </m:r>
@@ -4038,7 +4054,7 @@
               <m:nor/>
             </m:rPr>
             <w:rPr>
-              <w:rFonts w:ascii="Cambria Math" w:hAnsi="Cambria Math"/>
+              <w:rFonts w:ascii="Cambria Math" w:eastAsia="Cambria Math" w:hAnsi="Cambria Math" w:cs="Cambria Math"/>
             </w:rPr>
             <m:t>(Eq. 3)</m:t>
           </m:r>
@@ -4067,6 +4083,7 @@
         <w:jc w:val="both"/>
       </w:pPr>
       <w:r>
+        <w:lastRenderedPageBreak/>
         <w:t>The moment of inertia for a rectangular cross-section is:</w:t>
       </w:r>
     </w:p>
@@ -4080,7 +4097,7 @@
         <m:oMath>
           <m:r>
             <w:rPr>
-              <w:rFonts w:ascii="Cambria Math" w:hAnsi="Cambria Math"/>
+              <w:rFonts w:ascii="Cambria Math" w:eastAsia="Cambria Math" w:hAnsi="Cambria Math" w:cs="Cambria Math"/>
             </w:rPr>
             <m:t>I=</m:t>
           </m:r>
@@ -4088,14 +4105,14 @@
             <m:fPr>
               <m:ctrlPr>
                 <w:rPr>
-                  <w:rFonts w:ascii="Cambria Math" w:hAnsi="Cambria Math"/>
+                  <w:rFonts w:ascii="Cambria Math" w:eastAsia="Cambria Math" w:hAnsi="Cambria Math" w:cs="Cambria Math"/>
                 </w:rPr>
               </m:ctrlPr>
             </m:fPr>
             <m:num>
               <m:r>
                 <w:rPr>
-                  <w:rFonts w:ascii="Cambria Math" w:hAnsi="Cambria Math"/>
+                  <w:rFonts w:ascii="Cambria Math" w:eastAsia="Cambria Math" w:hAnsi="Cambria Math" w:cs="Cambria Math"/>
                 </w:rPr>
                 <m:t>b</m:t>
               </m:r>
@@ -4103,7 +4120,7 @@
                 <m:sSupPr>
                   <m:ctrlPr>
                     <w:rPr>
-                      <w:rFonts w:ascii="Cambria Math" w:hAnsi="Cambria Math"/>
+                      <w:rFonts w:ascii="Cambria Math" w:eastAsia="Cambria Math" w:hAnsi="Cambria Math" w:cs="Cambria Math"/>
                       <w:i/>
                     </w:rPr>
                   </m:ctrlPr>
@@ -4111,7 +4128,7 @@
                 <m:e>
                   <m:r>
                     <w:rPr>
-                      <w:rFonts w:ascii="Cambria Math" w:hAnsi="Cambria Math"/>
+                      <w:rFonts w:ascii="Cambria Math" w:eastAsia="Cambria Math" w:hAnsi="Cambria Math" w:cs="Cambria Math"/>
                     </w:rPr>
                     <m:t>h</m:t>
                   </m:r>
@@ -4119,7 +4136,7 @@
                 <m:sup>
                   <m:r>
                     <w:rPr>
-                      <w:rFonts w:ascii="Cambria Math" w:hAnsi="Cambria Math"/>
+                      <w:rFonts w:ascii="Cambria Math" w:eastAsia="Cambria Math" w:hAnsi="Cambria Math" w:cs="Cambria Math"/>
                     </w:rPr>
                     <m:t>3</m:t>
                   </m:r>
@@ -4127,7 +4144,7 @@
               </m:sSup>
               <m:ctrlPr>
                 <w:rPr>
-                  <w:rFonts w:ascii="Cambria Math" w:hAnsi="Cambria Math"/>
+                  <w:rFonts w:ascii="Cambria Math" w:eastAsia="Cambria Math" w:hAnsi="Cambria Math" w:cs="Cambria Math"/>
                   <w:i/>
                 </w:rPr>
               </m:ctrlPr>
@@ -4135,13 +4152,13 @@
             <m:den>
               <m:r>
                 <w:rPr>
-                  <w:rFonts w:ascii="Cambria Math" w:hAnsi="Cambria Math"/>
+                  <w:rFonts w:ascii="Cambria Math" w:eastAsia="Cambria Math" w:hAnsi="Cambria Math" w:cs="Cambria Math"/>
                 </w:rPr>
                 <m:t>12</m:t>
               </m:r>
               <m:ctrlPr>
                 <w:rPr>
-                  <w:rFonts w:ascii="Cambria Math" w:hAnsi="Cambria Math"/>
+                  <w:rFonts w:ascii="Cambria Math" w:eastAsia="Cambria Math" w:hAnsi="Cambria Math" w:cs="Cambria Math"/>
                   <w:i/>
                 </w:rPr>
               </m:ctrlPr>
@@ -4152,7 +4169,7 @@
               <m:sty m:val="p"/>
             </m:rPr>
             <w:rPr>
-              <w:rFonts w:ascii="Cambria Math" w:hAnsi="Cambria Math"/>
+              <w:rFonts w:ascii="Cambria Math" w:eastAsia="Cambria Math" w:hAnsi="Cambria Math" w:cs="Cambria Math"/>
             </w:rPr>
             <m:t> </m:t>
           </m:r>
@@ -4161,19 +4178,12 @@
               <m:nor/>
             </m:rPr>
             <w:rPr>
-              <w:rFonts w:ascii="Cambria Math" w:hAnsi="Cambria Math"/>
+              <w:rFonts w:ascii="Cambria Math" w:eastAsia="Cambria Math" w:hAnsi="Cambria Math" w:cs="Cambria Math"/>
             </w:rPr>
             <m:t>(Eq. 8)</m:t>
           </m:r>
         </m:oMath>
       </m:oMathPara>
-    </w:p>
-    <w:p>
-      <w:pPr>
-        <w:spacing w:before="300" w:after="300"/>
-        <w:ind w:left="720" w:right="720"/>
-        <w:jc w:val="center"/>
-      </w:pPr>
     </w:p>
     <w:p>
       <w:pPr>
@@ -5719,7 +5729,6 @@
         <w:jc w:val="both"/>
       </w:pPr>
       <w:r>
-        <w:lastRenderedPageBreak/>
         <w:t>I simulated corrosion-induced damage using the stiffness reduction method, which has been validated against experimental studies (Zhang et al., 2020; Rodriguez et al., 1997; Cairns et al., 2005). The effective moment of inertia is reduced uniformly across all elements:</w:t>
       </w:r>
     </w:p>
@@ -5733,7 +5742,7 @@
         <m:oMath>
           <m:r>
             <w:rPr>
-              <w:rFonts w:ascii="Cambria Math" w:hAnsi="Cambria Math"/>
+              <w:rFonts w:ascii="Cambria Math" w:eastAsia="Cambria Math" w:hAnsi="Cambria Math" w:cs="Cambria Math"/>
             </w:rPr>
             <m:t>E</m:t>
           </m:r>
@@ -5741,7 +5750,7 @@
             <m:sSubPr>
               <m:ctrlPr>
                 <w:rPr>
-                  <w:rFonts w:ascii="Cambria Math" w:hAnsi="Cambria Math"/>
+                  <w:rFonts w:ascii="Cambria Math" w:eastAsia="Cambria Math" w:hAnsi="Cambria Math" w:cs="Cambria Math"/>
                   <w:i/>
                 </w:rPr>
               </m:ctrlPr>
@@ -5749,7 +5758,7 @@
             <m:e>
               <m:r>
                 <w:rPr>
-                  <w:rFonts w:ascii="Cambria Math" w:hAnsi="Cambria Math"/>
+                  <w:rFonts w:ascii="Cambria Math" w:eastAsia="Cambria Math" w:hAnsi="Cambria Math" w:cs="Cambria Math"/>
                 </w:rPr>
                 <m:t>I</m:t>
               </m:r>
@@ -5762,13 +5771,13 @@
                 <w:rPr>
                   <w:rFonts w:ascii="Cambria Math" w:eastAsia="Cambria Math" w:hAnsi="Cambria Math" w:cs="Cambria Math"/>
                 </w:rPr>
-                <m:t xml:space="preserve">corroded </m:t>
+                <m:t>damaged</m:t>
               </m:r>
             </m:sub>
           </m:sSub>
           <m:r>
             <w:rPr>
-              <w:rFonts w:ascii="Cambria Math" w:hAnsi="Cambria Math"/>
+              <w:rFonts w:ascii="Cambria Math" w:eastAsia="Cambria Math" w:hAnsi="Cambria Math" w:cs="Cambria Math"/>
             </w:rPr>
             <m:t>=E</m:t>
           </m:r>
@@ -5776,7 +5785,7 @@
             <m:sSubPr>
               <m:ctrlPr>
                 <w:rPr>
-                  <w:rFonts w:ascii="Cambria Math" w:hAnsi="Cambria Math"/>
+                  <w:rFonts w:ascii="Cambria Math" w:eastAsia="Cambria Math" w:hAnsi="Cambria Math" w:cs="Cambria Math"/>
                   <w:i/>
                 </w:rPr>
               </m:ctrlPr>
@@ -5784,7 +5793,7 @@
             <m:e>
               <m:r>
                 <w:rPr>
-                  <w:rFonts w:ascii="Cambria Math" w:hAnsi="Cambria Math"/>
+                  <w:rFonts w:ascii="Cambria Math" w:eastAsia="Cambria Math" w:hAnsi="Cambria Math" w:cs="Cambria Math"/>
                 </w:rPr>
                 <m:t>I</m:t>
               </m:r>
@@ -5795,7 +5804,7 @@
                   <m:nor/>
                 </m:rPr>
                 <w:rPr>
-                  <w:rFonts w:ascii="Cambria Math" w:hAnsi="Cambria Math"/>
+                  <w:rFonts w:ascii="Cambria Math" w:eastAsia="Cambria Math" w:hAnsi="Cambria Math" w:cs="Cambria Math"/>
                 </w:rPr>
                 <m:t>original</m:t>
               </m:r>
@@ -5806,7 +5815,7 @@
               <m:sty m:val="p"/>
             </m:rPr>
             <w:rPr>
-              <w:rFonts w:ascii="Cambria Math" w:hAnsi="Cambria Math"/>
+              <w:rFonts w:ascii="Cambria Math" w:eastAsia="Cambria Math" w:hAnsi="Cambria Math" w:cs="Cambria Math"/>
             </w:rPr>
             <m:t>×</m:t>
           </m:r>
@@ -5814,7 +5823,7 @@
             <m:dPr>
               <m:ctrlPr>
                 <w:rPr>
-                  <w:rFonts w:ascii="Cambria Math" w:hAnsi="Cambria Math"/>
+                  <w:rFonts w:ascii="Cambria Math" w:eastAsia="Cambria Math" w:hAnsi="Cambria Math" w:cs="Cambria Math"/>
                   <w:i/>
                 </w:rPr>
               </m:ctrlPr>
@@ -5822,13 +5831,16 @@
             <m:e>
               <m:r>
                 <w:rPr>
-                  <w:rFonts w:ascii="Cambria Math" w:hAnsi="Cambria Math"/>
+                  <w:rFonts w:ascii="Cambria Math" w:eastAsia="Cambria Math" w:hAnsi="Cambria Math" w:cs="Cambria Math"/>
                 </w:rPr>
                 <m:t>1-</m:t>
               </m:r>
               <m:r>
+                <m:rPr>
+                  <m:sty m:val="p"/>
+                </m:rPr>
                 <w:rPr>
-                  <w:rFonts w:ascii="Cambria Math" w:hAnsi="Cambria Math"/>
+                  <w:rFonts w:ascii="Cambria Math" w:eastAsia="Cambria Math" w:hAnsi="Cambria Math" w:cs="Cambria Math"/>
                 </w:rPr>
                 <m:t>α</m:t>
               </m:r>
@@ -5839,7 +5851,7 @@
               <m:sty m:val="p"/>
             </m:rPr>
             <w:rPr>
-              <w:rFonts w:ascii="Cambria Math" w:hAnsi="Cambria Math"/>
+              <w:rFonts w:ascii="Cambria Math" w:eastAsia="Cambria Math" w:hAnsi="Cambria Math" w:cs="Cambria Math"/>
             </w:rPr>
             <m:t> </m:t>
           </m:r>
@@ -5848,7 +5860,7 @@
               <m:nor/>
             </m:rPr>
             <w:rPr>
-              <w:rFonts w:ascii="Cambria Math" w:hAnsi="Cambria Math"/>
+              <w:rFonts w:ascii="Cambria Math" w:eastAsia="Cambria Math" w:hAnsi="Cambria Math" w:cs="Cambria Math"/>
             </w:rPr>
             <m:t>(Eq. 6)</m:t>
           </m:r>
@@ -5884,13 +5896,13 @@
               <m:sty m:val="p"/>
             </m:rPr>
             <w:rPr>
-              <w:rFonts w:ascii="Cambria Math" w:hAnsi="Cambria Math"/>
+              <w:rFonts w:ascii="Cambria Math" w:eastAsia="Cambria Math" w:hAnsi="Cambria Math" w:cs="Cambria Math"/>
             </w:rPr>
             <m:t>α</m:t>
           </m:r>
           <m:r>
             <w:rPr>
-              <w:rFonts w:ascii="Cambria Math" w:hAnsi="Cambria Math"/>
+              <w:rFonts w:ascii="Cambria Math" w:eastAsia="Cambria Math" w:hAnsi="Cambria Math" w:cs="Cambria Math"/>
             </w:rPr>
             <m:t>=</m:t>
           </m:r>
@@ -5898,7 +5910,7 @@
             <m:funcPr>
               <m:ctrlPr>
                 <w:rPr>
-                  <w:rFonts w:ascii="Cambria Math" w:hAnsi="Cambria Math"/>
+                  <w:rFonts w:ascii="Cambria Math" w:eastAsia="Cambria Math" w:hAnsi="Cambria Math" w:cs="Cambria Math"/>
                 </w:rPr>
               </m:ctrlPr>
             </m:funcPr>
@@ -5908,13 +5920,13 @@
                   <m:sty m:val="p"/>
                 </m:rPr>
                 <w:rPr>
-                  <w:rFonts w:ascii="Cambria Math" w:hAnsi="Cambria Math"/>
+                  <w:rFonts w:ascii="Cambria Math" w:eastAsia="Cambria Math" w:hAnsi="Cambria Math" w:cs="Cambria Math"/>
                 </w:rPr>
                 <m:t>min</m:t>
               </m:r>
               <m:ctrlPr>
                 <w:rPr>
-                  <w:rFonts w:ascii="Cambria Math" w:hAnsi="Cambria Math"/>
+                  <w:rFonts w:ascii="Cambria Math" w:eastAsia="Cambria Math" w:hAnsi="Cambria Math" w:cs="Cambria Math"/>
                   <w:i/>
                 </w:rPr>
               </m:ctrlPr>
@@ -5924,14 +5936,14 @@
                 <m:dPr>
                   <m:ctrlPr>
                     <w:rPr>
-                      <w:rFonts w:ascii="Cambria Math" w:hAnsi="Cambria Math"/>
+                      <w:rFonts w:ascii="Cambria Math" w:eastAsia="Cambria Math" w:hAnsi="Cambria Math" w:cs="Cambria Math"/>
                     </w:rPr>
                   </m:ctrlPr>
                 </m:dPr>
                 <m:e>
                   <m:r>
                     <w:rPr>
-                      <w:rFonts w:ascii="Cambria Math" w:hAnsi="Cambria Math"/>
+                      <w:rFonts w:ascii="Cambria Math" w:eastAsia="Cambria Math" w:hAnsi="Cambria Math" w:cs="Cambria Math"/>
                     </w:rPr>
                     <m:t>1.6</m:t>
                   </m:r>
@@ -5940,7 +5952,7 @@
                       <m:sty m:val="p"/>
                     </m:rPr>
                     <w:rPr>
-                      <w:rFonts w:ascii="Cambria Math" w:hAnsi="Cambria Math"/>
+                      <w:rFonts w:ascii="Cambria Math" w:eastAsia="Cambria Math" w:hAnsi="Cambria Math" w:cs="Cambria Math"/>
                     </w:rPr>
                     <m:t>×</m:t>
                   </m:r>
@@ -5948,20 +5960,20 @@
                     <m:fPr>
                       <m:ctrlPr>
                         <w:rPr>
-                          <w:rFonts w:ascii="Cambria Math" w:hAnsi="Cambria Math"/>
+                          <w:rFonts w:ascii="Cambria Math" w:eastAsia="Cambria Math" w:hAnsi="Cambria Math" w:cs="Cambria Math"/>
                         </w:rPr>
                       </m:ctrlPr>
                     </m:fPr>
                     <m:num>
                       <m:r>
                         <w:rPr>
-                          <w:rFonts w:ascii="Cambria Math" w:hAnsi="Cambria Math"/>
+                          <w:rFonts w:ascii="Cambria Math" w:eastAsia="Cambria Math" w:hAnsi="Cambria Math" w:cs="Cambria Math"/>
                         </w:rPr>
                         <m:t>C</m:t>
                       </m:r>
                       <m:ctrlPr>
                         <w:rPr>
-                          <w:rFonts w:ascii="Cambria Math" w:hAnsi="Cambria Math"/>
+                          <w:rFonts w:ascii="Cambria Math" w:eastAsia="Cambria Math" w:hAnsi="Cambria Math" w:cs="Cambria Math"/>
                           <w:i/>
                         </w:rPr>
                       </m:ctrlPr>
@@ -5969,13 +5981,13 @@
                     <m:den>
                       <m:r>
                         <w:rPr>
-                          <w:rFonts w:ascii="Cambria Math" w:hAnsi="Cambria Math"/>
+                          <w:rFonts w:ascii="Cambria Math" w:eastAsia="Cambria Math" w:hAnsi="Cambria Math" w:cs="Cambria Math"/>
                         </w:rPr>
                         <m:t>100</m:t>
                       </m:r>
                       <m:ctrlPr>
                         <w:rPr>
-                          <w:rFonts w:ascii="Cambria Math" w:hAnsi="Cambria Math"/>
+                          <w:rFonts w:ascii="Cambria Math" w:eastAsia="Cambria Math" w:hAnsi="Cambria Math" w:cs="Cambria Math"/>
                           <w:i/>
                         </w:rPr>
                       </m:ctrlPr>
@@ -5983,13 +5995,13 @@
                   </m:f>
                   <m:r>
                     <w:rPr>
-                      <w:rFonts w:ascii="Cambria Math" w:hAnsi="Cambria Math"/>
+                      <w:rFonts w:ascii="Cambria Math" w:eastAsia="Cambria Math" w:hAnsi="Cambria Math" w:cs="Cambria Math"/>
                     </w:rPr>
                     <m:t>,0.9</m:t>
                   </m:r>
                   <m:ctrlPr>
                     <w:rPr>
-                      <w:rFonts w:ascii="Cambria Math" w:hAnsi="Cambria Math"/>
+                      <w:rFonts w:ascii="Cambria Math" w:eastAsia="Cambria Math" w:hAnsi="Cambria Math" w:cs="Cambria Math"/>
                       <w:i/>
                     </w:rPr>
                   </m:ctrlPr>
@@ -6002,7 +6014,7 @@
               <m:sty m:val="p"/>
             </m:rPr>
             <w:rPr>
-              <w:rFonts w:ascii="Cambria Math" w:hAnsi="Cambria Math"/>
+              <w:rFonts w:ascii="Cambria Math" w:eastAsia="Cambria Math" w:hAnsi="Cambria Math" w:cs="Cambria Math"/>
             </w:rPr>
             <m:t> </m:t>
           </m:r>
@@ -6011,7 +6023,7 @@
               <m:nor/>
             </m:rPr>
             <w:rPr>
-              <w:rFonts w:ascii="Cambria Math" w:hAnsi="Cambria Math"/>
+              <w:rFonts w:ascii="Cambria Math" w:eastAsia="Cambria Math" w:hAnsi="Cambria Math" w:cs="Cambria Math"/>
             </w:rPr>
             <m:t>(Eq. 11)</m:t>
           </m:r>
@@ -6094,11 +6106,7 @@
         <w:jc w:val="both"/>
       </w:pPr>
       <w:r>
-        <w:t xml:space="preserve">I generated a comprehensive dataset of 3,000 simulations using Latin Hypercube Sampling via scipy.stats.qmc (Virtanen et al., 2020). LHS ensures uniform coverage of the five-dimensional </w:t>
-      </w:r>
-      <w:r>
-        <w:lastRenderedPageBreak/>
-        <w:t>parameter space and has better convergence properties than Monte Carlo sampling for engineering simulations (Helton &amp; Davis, 2003).</w:t>
+        <w:t>I generated a comprehensive dataset of 3,000 simulations using Latin Hypercube Sampling via scipy.stats.qmc (Virtanen et al., 2020). LHS ensures uniform coverage of the five-dimensional parameter space and has better convergence properties than Monte Carlo sampling for engineering simulations (Helton &amp; Davis, 2003).</w:t>
       </w:r>
     </w:p>
     <w:p>
@@ -6278,6 +6286,7 @@
                 <w:sz w:val="22"/>
                 <w:szCs w:val="22"/>
               </w:rPr>
+              <w:lastRenderedPageBreak/>
               <w:t>Length</w:t>
             </w:r>
           </w:p>
@@ -6793,7 +6802,6 @@
         <w:jc w:val="both"/>
       </w:pPr>
       <w:r>
-        <w:lastRenderedPageBreak/>
         <w:t>Feature Scaling: StandardScaler normalization transforms features to zero mean and unit variance:</w:t>
       </w:r>
     </w:p>
@@ -6809,7 +6817,7 @@
             <m:sSubPr>
               <m:ctrlPr>
                 <w:rPr>
-                  <w:rFonts w:ascii="Cambria Math" w:hAnsi="Cambria Math"/>
+                  <w:rFonts w:ascii="Cambria Math" w:eastAsia="Cambria Math" w:hAnsi="Cambria Math" w:cs="Cambria Math"/>
                   <w:i/>
                 </w:rPr>
               </m:ctrlPr>
@@ -6817,7 +6825,7 @@
             <m:e>
               <m:r>
                 <w:rPr>
-                  <w:rFonts w:ascii="Cambria Math" w:hAnsi="Cambria Math"/>
+                  <w:rFonts w:ascii="Cambria Math" w:eastAsia="Cambria Math" w:hAnsi="Cambria Math" w:cs="Cambria Math"/>
                 </w:rPr>
                 <m:t>X</m:t>
               </m:r>
@@ -6828,7 +6836,7 @@
                   <m:nor/>
                 </m:rPr>
                 <w:rPr>
-                  <w:rFonts w:ascii="Cambria Math" w:hAnsi="Cambria Math"/>
+                  <w:rFonts w:ascii="Cambria Math" w:eastAsia="Cambria Math" w:hAnsi="Cambria Math" w:cs="Cambria Math"/>
                 </w:rPr>
                 <m:t>scaled</m:t>
               </m:r>
@@ -6836,7 +6844,7 @@
           </m:sSub>
           <m:r>
             <w:rPr>
-              <w:rFonts w:ascii="Cambria Math" w:hAnsi="Cambria Math"/>
+              <w:rFonts w:ascii="Cambria Math" w:eastAsia="Cambria Math" w:hAnsi="Cambria Math" w:cs="Cambria Math"/>
             </w:rPr>
             <m:t>=</m:t>
           </m:r>
@@ -6844,14 +6852,14 @@
             <m:fPr>
               <m:ctrlPr>
                 <w:rPr>
-                  <w:rFonts w:ascii="Cambria Math" w:hAnsi="Cambria Math"/>
+                  <w:rFonts w:ascii="Cambria Math" w:eastAsia="Cambria Math" w:hAnsi="Cambria Math" w:cs="Cambria Math"/>
                 </w:rPr>
               </m:ctrlPr>
             </m:fPr>
             <m:num>
               <m:r>
                 <w:rPr>
-                  <w:rFonts w:ascii="Cambria Math" w:hAnsi="Cambria Math"/>
+                  <w:rFonts w:ascii="Cambria Math" w:eastAsia="Cambria Math" w:hAnsi="Cambria Math" w:cs="Cambria Math"/>
                 </w:rPr>
                 <m:t>X-</m:t>
               </m:r>
@@ -6860,13 +6868,13 @@
                   <m:sty m:val="p"/>
                 </m:rPr>
                 <w:rPr>
-                  <w:rFonts w:ascii="Cambria Math" w:hAnsi="Cambria Math"/>
+                  <w:rFonts w:ascii="Cambria Math" w:eastAsia="Cambria Math" w:hAnsi="Cambria Math" w:cs="Cambria Math"/>
                 </w:rPr>
                 <m:t>μ</m:t>
               </m:r>
               <m:ctrlPr>
                 <w:rPr>
-                  <w:rFonts w:ascii="Cambria Math" w:hAnsi="Cambria Math"/>
+                  <w:rFonts w:ascii="Cambria Math" w:eastAsia="Cambria Math" w:hAnsi="Cambria Math" w:cs="Cambria Math"/>
                   <w:i/>
                 </w:rPr>
               </m:ctrlPr>
@@ -6877,13 +6885,13 @@
                   <m:sty m:val="p"/>
                 </m:rPr>
                 <w:rPr>
-                  <w:rFonts w:ascii="Cambria Math" w:hAnsi="Cambria Math"/>
+                  <w:rFonts w:ascii="Cambria Math" w:eastAsia="Cambria Math" w:hAnsi="Cambria Math" w:cs="Cambria Math"/>
                 </w:rPr>
                 <m:t>σ</m:t>
               </m:r>
               <m:ctrlPr>
                 <w:rPr>
-                  <w:rFonts w:ascii="Cambria Math" w:hAnsi="Cambria Math"/>
+                  <w:rFonts w:ascii="Cambria Math" w:eastAsia="Cambria Math" w:hAnsi="Cambria Math" w:cs="Cambria Math"/>
                   <w:i/>
                 </w:rPr>
               </m:ctrlPr>
@@ -6894,7 +6902,7 @@
               <m:sty m:val="p"/>
             </m:rPr>
             <w:rPr>
-              <w:rFonts w:ascii="Cambria Math" w:hAnsi="Cambria Math"/>
+              <w:rFonts w:ascii="Cambria Math" w:eastAsia="Cambria Math" w:hAnsi="Cambria Math" w:cs="Cambria Math"/>
             </w:rPr>
             <m:t> </m:t>
           </m:r>
@@ -6903,7 +6911,7 @@
               <m:nor/>
             </m:rPr>
             <w:rPr>
-              <w:rFonts w:ascii="Cambria Math" w:hAnsi="Cambria Math"/>
+              <w:rFonts w:ascii="Cambria Math" w:eastAsia="Cambria Math" w:hAnsi="Cambria Math" w:cs="Cambria Math"/>
             </w:rPr>
             <m:t>(Eq. 12)</m:t>
           </m:r>
@@ -6923,6 +6931,7 @@
         <w:jc w:val="both"/>
       </w:pPr>
       <w:r>
+        <w:lastRenderedPageBreak/>
         <w:t>This preprocessing is critical for SVR with RBF kernels, which are sensitive to feature magnitudes (Cortes &amp; Vapnik, 1995). While tree-based methods are invariant to monotonic transformations, I scaled all features consistently for fair comparison.</w:t>
       </w:r>
     </w:p>
@@ -7004,7 +7013,6 @@
         <w:spacing w:before="400" w:after="200" w:line="360" w:lineRule="auto"/>
       </w:pPr>
       <w:r>
-        <w:lastRenderedPageBreak/>
         <w:t>3.8.1 Software Platforms</w:t>
       </w:r>
     </w:p>
@@ -7032,6 +7040,7 @@
         <w:jc w:val="both"/>
       </w:pPr>
       <w:r>
+        <w:lastRenderedPageBreak/>
         <w:t>For data preprocessing and model implementation, I used Scikit-learn (Pedregosa et al., 2011), XGBoost (Chen &amp; Guestrin, 2016), and CatBoost (Prokhorenkova et al., 2018). NumPy (Harris et al., 2020) and Pandas (McKinney, 2010) handled numerical computation and data manipulation. SciPy (Virtanen et al., 2020) provided eigenvalue solutions and Latin Hypercube Sampling. Matplotlib and Seaborn generated visualizations. SHAP provided model-agnostic feature importance analysis.</w:t>
       </w:r>
     </w:p>
@@ -7104,17 +7113,20 @@
         <w:spacing w:before="400" w:after="200" w:line="360" w:lineRule="auto"/>
       </w:pPr>
       <w:r>
+        <w:t>3.9.3 Limitations Acknowledgment</w:t>
+      </w:r>
+    </w:p>
+    <w:p>
+      <w:pPr>
+        <w:spacing w:after="200" w:line="360" w:lineRule="auto"/>
+        <w:jc w:val="both"/>
+      </w:pPr>
+      <w:r>
+        <w:t xml:space="preserve">Several limitations affect result generalizability. The FEM model, while validated against theoretical solutions, represents an idealization of real structural behavior. Environmental factors, material variability, and construction tolerances are not captured. The fixed-fixed boundary condition represents an idealized restraint that may not perfectly match field </w:t>
+      </w:r>
+      <w:r>
         <w:lastRenderedPageBreak/>
-        <w:t>3.9.3 Limitations Acknowledgment</w:t>
-      </w:r>
-    </w:p>
-    <w:p>
-      <w:pPr>
-        <w:spacing w:after="200" w:line="360" w:lineRule="auto"/>
-        <w:jc w:val="both"/>
-      </w:pPr>
-      <w:r>
-        <w:t>Several limitations affect result generalizability. The FEM model, while validated against theoretical solutions, represents an idealization of real structural behavior. Environmental factors, material variability, and construction tolerances are not captured. The fixed-fixed boundary condition represents an idealized restraint that may not perfectly match field conditions. Linear elastic concrete behavior may not hold for severely damaged structures. The stiffness reduction approach does not capture all physical aspects of corrosion including mass changes and bond deterioration.</w:t>
+        <w:t>conditions. Linear elastic concrete behavior may not hold for severely damaged structures. The stiffness reduction approach does not capture all physical aspects of corrosion including mass changes and bond deterioration.</w:t>
       </w:r>
     </w:p>
     <w:p>
@@ -8198,10 +8210,10 @@
           <w:noProof/>
         </w:rPr>
         <w:drawing>
-          <wp:inline distT="0" distB="0" distL="0" distR="0" wp14:anchorId="68B3AD53" wp14:editId="500D40BD">
+          <wp:inline distT="0" distB="0" distL="0" distR="0" wp14:anchorId="2C0D9E0F" wp14:editId="21757F5E">
             <wp:extent cx="4762500" cy="3333750"/>
             <wp:effectExtent l="0" t="0" r="0" b="0"/>
-            <wp:docPr id="1730480361" name="Picture 1730480361"/>
+            <wp:docPr id="1282694886" name="Picture 1282694886"/>
             <wp:cNvGraphicFramePr>
               <a:graphicFrameLocks xmlns:a="http://schemas.openxmlformats.org/drawingml/2006/main" noChangeAspect="1"/>
             </wp:cNvGraphicFramePr>
@@ -9223,7 +9235,7 @@
         <m:oMath>
           <m:r>
             <w:rPr>
-              <w:rFonts w:ascii="Cambria Math" w:hAnsi="Cambria Math"/>
+              <w:rFonts w:ascii="Cambria Math" w:eastAsia="Cambria Math" w:hAnsi="Cambria Math" w:cs="Cambria Math"/>
             </w:rPr>
             <m:t>f</m:t>
           </m:r>
@@ -9232,7 +9244,7 @@
               <m:sty m:val="p"/>
             </m:rPr>
             <w:rPr>
-              <w:rFonts w:ascii="Cambria Math" w:hAnsi="Cambria Math"/>
+              <w:rFonts w:ascii="Cambria Math" w:eastAsia="Cambria Math" w:hAnsi="Cambria Math" w:cs="Cambria Math"/>
             </w:rPr>
             <m:t>∝</m:t>
           </m:r>
@@ -9240,20 +9252,20 @@
             <m:fPr>
               <m:ctrlPr>
                 <w:rPr>
-                  <w:rFonts w:ascii="Cambria Math" w:hAnsi="Cambria Math"/>
+                  <w:rFonts w:ascii="Cambria Math" w:eastAsia="Cambria Math" w:hAnsi="Cambria Math" w:cs="Cambria Math"/>
                 </w:rPr>
               </m:ctrlPr>
             </m:fPr>
             <m:num>
               <m:r>
                 <w:rPr>
-                  <w:rFonts w:ascii="Cambria Math" w:hAnsi="Cambria Math"/>
+                  <w:rFonts w:ascii="Cambria Math" w:eastAsia="Cambria Math" w:hAnsi="Cambria Math" w:cs="Cambria Math"/>
                 </w:rPr>
                 <m:t>1</m:t>
               </m:r>
               <m:ctrlPr>
                 <w:rPr>
-                  <w:rFonts w:ascii="Cambria Math" w:hAnsi="Cambria Math"/>
+                  <w:rFonts w:ascii="Cambria Math" w:eastAsia="Cambria Math" w:hAnsi="Cambria Math" w:cs="Cambria Math"/>
                   <w:i/>
                 </w:rPr>
               </m:ctrlPr>
@@ -9263,7 +9275,7 @@
                 <m:sSupPr>
                   <m:ctrlPr>
                     <w:rPr>
-                      <w:rFonts w:ascii="Cambria Math" w:hAnsi="Cambria Math"/>
+                      <w:rFonts w:ascii="Cambria Math" w:eastAsia="Cambria Math" w:hAnsi="Cambria Math" w:cs="Cambria Math"/>
                       <w:i/>
                     </w:rPr>
                   </m:ctrlPr>
@@ -9271,7 +9283,7 @@
                 <m:e>
                   <m:r>
                     <w:rPr>
-                      <w:rFonts w:ascii="Cambria Math" w:hAnsi="Cambria Math"/>
+                      <w:rFonts w:ascii="Cambria Math" w:eastAsia="Cambria Math" w:hAnsi="Cambria Math" w:cs="Cambria Math"/>
                     </w:rPr>
                     <m:t>L</m:t>
                   </m:r>
@@ -9279,7 +9291,7 @@
                 <m:sup>
                   <m:r>
                     <w:rPr>
-                      <w:rFonts w:ascii="Cambria Math" w:hAnsi="Cambria Math"/>
+                      <w:rFonts w:ascii="Cambria Math" w:eastAsia="Cambria Math" w:hAnsi="Cambria Math" w:cs="Cambria Math"/>
                     </w:rPr>
                     <m:t>2</m:t>
                   </m:r>
@@ -9287,7 +9299,7 @@
               </m:sSup>
               <m:ctrlPr>
                 <w:rPr>
-                  <w:rFonts w:ascii="Cambria Math" w:hAnsi="Cambria Math"/>
+                  <w:rFonts w:ascii="Cambria Math" w:eastAsia="Cambria Math" w:hAnsi="Cambria Math" w:cs="Cambria Math"/>
                   <w:i/>
                 </w:rPr>
               </m:ctrlPr>
@@ -9298,14 +9310,14 @@
               <m:degHide m:val="1"/>
               <m:ctrlPr>
                 <w:rPr>
-                  <w:rFonts w:ascii="Cambria Math" w:hAnsi="Cambria Math"/>
+                  <w:rFonts w:ascii="Cambria Math" w:eastAsia="Cambria Math" w:hAnsi="Cambria Math" w:cs="Cambria Math"/>
                 </w:rPr>
               </m:ctrlPr>
             </m:radPr>
             <m:deg>
               <m:ctrlPr>
                 <w:rPr>
-                  <w:rFonts w:ascii="Cambria Math" w:hAnsi="Cambria Math"/>
+                  <w:rFonts w:ascii="Cambria Math" w:eastAsia="Cambria Math" w:hAnsi="Cambria Math" w:cs="Cambria Math"/>
                   <w:i/>
                 </w:rPr>
               </m:ctrlPr>
@@ -9315,20 +9327,20 @@
                 <m:fPr>
                   <m:ctrlPr>
                     <w:rPr>
-                      <w:rFonts w:ascii="Cambria Math" w:hAnsi="Cambria Math"/>
+                      <w:rFonts w:ascii="Cambria Math" w:eastAsia="Cambria Math" w:hAnsi="Cambria Math" w:cs="Cambria Math"/>
                     </w:rPr>
                   </m:ctrlPr>
                 </m:fPr>
                 <m:num>
                   <m:r>
                     <w:rPr>
-                      <w:rFonts w:ascii="Cambria Math" w:hAnsi="Cambria Math"/>
+                      <w:rFonts w:ascii="Cambria Math" w:eastAsia="Cambria Math" w:hAnsi="Cambria Math" w:cs="Cambria Math"/>
                     </w:rPr>
                     <m:t>EI</m:t>
                   </m:r>
                   <m:ctrlPr>
                     <w:rPr>
-                      <w:rFonts w:ascii="Cambria Math" w:hAnsi="Cambria Math"/>
+                      <w:rFonts w:ascii="Cambria Math" w:eastAsia="Cambria Math" w:hAnsi="Cambria Math" w:cs="Cambria Math"/>
                       <w:i/>
                     </w:rPr>
                   </m:ctrlPr>
@@ -9339,19 +9351,19 @@
                       <m:sty m:val="p"/>
                     </m:rPr>
                     <w:rPr>
-                      <w:rFonts w:ascii="Cambria Math" w:hAnsi="Cambria Math"/>
+                      <w:rFonts w:ascii="Cambria Math" w:eastAsia="Cambria Math" w:hAnsi="Cambria Math" w:cs="Cambria Math"/>
                     </w:rPr>
                     <m:t>ρ</m:t>
                   </m:r>
                   <m:r>
                     <w:rPr>
-                      <w:rFonts w:ascii="Cambria Math" w:hAnsi="Cambria Math"/>
+                      <w:rFonts w:ascii="Cambria Math" w:eastAsia="Cambria Math" w:hAnsi="Cambria Math" w:cs="Cambria Math"/>
                     </w:rPr>
                     <m:t>A</m:t>
                   </m:r>
                   <m:ctrlPr>
                     <w:rPr>
-                      <w:rFonts w:ascii="Cambria Math" w:hAnsi="Cambria Math"/>
+                      <w:rFonts w:ascii="Cambria Math" w:eastAsia="Cambria Math" w:hAnsi="Cambria Math" w:cs="Cambria Math"/>
                       <w:i/>
                     </w:rPr>
                   </m:ctrlPr>
@@ -9364,7 +9376,7 @@
               <m:sty m:val="p"/>
             </m:rPr>
             <w:rPr>
-              <w:rFonts w:ascii="Cambria Math" w:hAnsi="Cambria Math"/>
+              <w:rFonts w:ascii="Cambria Math" w:eastAsia="Cambria Math" w:hAnsi="Cambria Math" w:cs="Cambria Math"/>
             </w:rPr>
             <m:t>∝</m:t>
           </m:r>
@@ -9372,20 +9384,20 @@
             <m:fPr>
               <m:ctrlPr>
                 <w:rPr>
-                  <w:rFonts w:ascii="Cambria Math" w:hAnsi="Cambria Math"/>
+                  <w:rFonts w:ascii="Cambria Math" w:eastAsia="Cambria Math" w:hAnsi="Cambria Math" w:cs="Cambria Math"/>
                 </w:rPr>
               </m:ctrlPr>
             </m:fPr>
             <m:num>
               <m:r>
                 <w:rPr>
-                  <w:rFonts w:ascii="Cambria Math" w:hAnsi="Cambria Math"/>
+                  <w:rFonts w:ascii="Cambria Math" w:eastAsia="Cambria Math" w:hAnsi="Cambria Math" w:cs="Cambria Math"/>
                 </w:rPr>
                 <m:t>h</m:t>
               </m:r>
               <m:ctrlPr>
                 <w:rPr>
-                  <w:rFonts w:ascii="Cambria Math" w:hAnsi="Cambria Math"/>
+                  <w:rFonts w:ascii="Cambria Math" w:eastAsia="Cambria Math" w:hAnsi="Cambria Math" w:cs="Cambria Math"/>
                   <w:i/>
                 </w:rPr>
               </m:ctrlPr>
@@ -9395,7 +9407,7 @@
                 <m:sSupPr>
                   <m:ctrlPr>
                     <w:rPr>
-                      <w:rFonts w:ascii="Cambria Math" w:hAnsi="Cambria Math"/>
+                      <w:rFonts w:ascii="Cambria Math" w:eastAsia="Cambria Math" w:hAnsi="Cambria Math" w:cs="Cambria Math"/>
                       <w:i/>
                     </w:rPr>
                   </m:ctrlPr>
@@ -9403,7 +9415,7 @@
                 <m:e>
                   <m:r>
                     <w:rPr>
-                      <w:rFonts w:ascii="Cambria Math" w:hAnsi="Cambria Math"/>
+                      <w:rFonts w:ascii="Cambria Math" w:eastAsia="Cambria Math" w:hAnsi="Cambria Math" w:cs="Cambria Math"/>
                     </w:rPr>
                     <m:t>L</m:t>
                   </m:r>
@@ -9411,7 +9423,7 @@
                 <m:sup>
                   <m:r>
                     <w:rPr>
-                      <w:rFonts w:ascii="Cambria Math" w:hAnsi="Cambria Math"/>
+                      <w:rFonts w:ascii="Cambria Math" w:eastAsia="Cambria Math" w:hAnsi="Cambria Math" w:cs="Cambria Math"/>
                     </w:rPr>
                     <m:t>2</m:t>
                   </m:r>
@@ -9419,7 +9431,7 @@
               </m:sSup>
               <m:ctrlPr>
                 <w:rPr>
-                  <w:rFonts w:ascii="Cambria Math" w:hAnsi="Cambria Math"/>
+                  <w:rFonts w:ascii="Cambria Math" w:eastAsia="Cambria Math" w:hAnsi="Cambria Math" w:cs="Cambria Math"/>
                   <w:i/>
                 </w:rPr>
               </m:ctrlPr>
@@ -9430,14 +9442,14 @@
               <m:degHide m:val="1"/>
               <m:ctrlPr>
                 <w:rPr>
-                  <w:rFonts w:ascii="Cambria Math" w:hAnsi="Cambria Math"/>
+                  <w:rFonts w:ascii="Cambria Math" w:eastAsia="Cambria Math" w:hAnsi="Cambria Math" w:cs="Cambria Math"/>
                 </w:rPr>
               </m:ctrlPr>
             </m:radPr>
             <m:deg>
               <m:ctrlPr>
                 <w:rPr>
-                  <w:rFonts w:ascii="Cambria Math" w:hAnsi="Cambria Math"/>
+                  <w:rFonts w:ascii="Cambria Math" w:eastAsia="Cambria Math" w:hAnsi="Cambria Math" w:cs="Cambria Math"/>
                   <w:i/>
                 </w:rPr>
               </m:ctrlPr>
@@ -9447,7 +9459,7 @@
                 <m:sSubSupPr>
                   <m:ctrlPr>
                     <w:rPr>
-                      <w:rFonts w:ascii="Cambria Math" w:hAnsi="Cambria Math"/>
+                      <w:rFonts w:ascii="Cambria Math" w:eastAsia="Cambria Math" w:hAnsi="Cambria Math" w:cs="Cambria Math"/>
                       <w:i/>
                     </w:rPr>
                   </m:ctrlPr>
@@ -9455,7 +9467,7 @@
                 <m:e>
                   <m:r>
                     <w:rPr>
-                      <w:rFonts w:ascii="Cambria Math" w:hAnsi="Cambria Math"/>
+                      <w:rFonts w:ascii="Cambria Math" w:eastAsia="Cambria Math" w:hAnsi="Cambria Math" w:cs="Cambria Math"/>
                     </w:rPr>
                     <m:t>f</m:t>
                   </m:r>
@@ -9463,7 +9475,7 @@
                 <m:sub>
                   <m:r>
                     <w:rPr>
-                      <w:rFonts w:ascii="Cambria Math" w:hAnsi="Cambria Math"/>
+                      <w:rFonts w:ascii="Cambria Math" w:eastAsia="Cambria Math" w:hAnsi="Cambria Math" w:cs="Cambria Math"/>
                     </w:rPr>
                     <m:t>c</m:t>
                   </m:r>
@@ -9471,7 +9483,7 @@
                 <m:sup>
                   <m:r>
                     <w:rPr>
-                      <w:rFonts w:ascii="Cambria Math" w:hAnsi="Cambria Math"/>
+                      <w:rFonts w:ascii="Cambria Math" w:eastAsia="Cambria Math" w:hAnsi="Cambria Math" w:cs="Cambria Math"/>
                     </w:rPr>
                     <m:t>'</m:t>
                   </m:r>
@@ -9484,7 +9496,7 @@
               <m:sty m:val="p"/>
             </m:rPr>
             <w:rPr>
-              <w:rFonts w:ascii="Cambria Math" w:hAnsi="Cambria Math"/>
+              <w:rFonts w:ascii="Cambria Math" w:eastAsia="Cambria Math" w:hAnsi="Cambria Math" w:cs="Cambria Math"/>
             </w:rPr>
             <m:t> </m:t>
           </m:r>
@@ -9493,7 +9505,7 @@
               <m:nor/>
             </m:rPr>
             <w:rPr>
-              <w:rFonts w:ascii="Cambria Math" w:hAnsi="Cambria Math"/>
+              <w:rFonts w:ascii="Cambria Math" w:eastAsia="Cambria Math" w:hAnsi="Cambria Math" w:cs="Cambria Math"/>
             </w:rPr>
             <m:t>(Eq. 13)</m:t>
           </m:r>
@@ -9553,10 +9565,10 @@
           <w:noProof/>
         </w:rPr>
         <w:drawing>
-          <wp:inline distT="0" distB="0" distL="0" distR="0" wp14:anchorId="2779689B" wp14:editId="77AEC2E5">
+          <wp:inline distT="0" distB="0" distL="0" distR="0" wp14:anchorId="33A3EB6D" wp14:editId="328B89DE">
             <wp:extent cx="4762500" cy="3333750"/>
             <wp:effectExtent l="0" t="0" r="0" b="0"/>
-            <wp:docPr id="93650264" name="Picture 93650264"/>
+            <wp:docPr id="1747106676" name="Picture 1747106676"/>
             <wp:cNvGraphicFramePr>
               <a:graphicFrameLocks xmlns:a="http://schemas.openxmlformats.org/drawingml/2006/main" noChangeAspect="1"/>
             </wp:cNvGraphicFramePr>
@@ -9630,7 +9642,7 @@
             <m:fPr>
               <m:ctrlPr>
                 <w:rPr>
-                  <w:rFonts w:ascii="Cambria Math" w:hAnsi="Cambria Math"/>
+                  <w:rFonts w:ascii="Cambria Math" w:eastAsia="Cambria Math" w:hAnsi="Cambria Math" w:cs="Cambria Math"/>
                 </w:rPr>
               </m:ctrlPr>
             </m:fPr>
@@ -9639,7 +9651,7 @@
                 <m:sSubPr>
                   <m:ctrlPr>
                     <w:rPr>
-                      <w:rFonts w:ascii="Cambria Math" w:hAnsi="Cambria Math"/>
+                      <w:rFonts w:ascii="Cambria Math" w:eastAsia="Cambria Math" w:hAnsi="Cambria Math" w:cs="Cambria Math"/>
                       <w:i/>
                     </w:rPr>
                   </m:ctrlPr>
@@ -9647,7 +9659,7 @@
                 <m:e>
                   <m:r>
                     <w:rPr>
-                      <w:rFonts w:ascii="Cambria Math" w:hAnsi="Cambria Math"/>
+                      <w:rFonts w:ascii="Cambria Math" w:eastAsia="Cambria Math" w:hAnsi="Cambria Math" w:cs="Cambria Math"/>
                     </w:rPr>
                     <m:t>f</m:t>
                   </m:r>
@@ -9658,7 +9670,7 @@
                       <m:nor/>
                     </m:rPr>
                     <w:rPr>
-                      <w:rFonts w:ascii="Cambria Math" w:hAnsi="Cambria Math"/>
+                      <w:rFonts w:ascii="Cambria Math" w:eastAsia="Cambria Math" w:hAnsi="Cambria Math" w:cs="Cambria Math"/>
                     </w:rPr>
                     <m:t>corroded</m:t>
                   </m:r>
@@ -9666,7 +9678,7 @@
               </m:sSub>
               <m:ctrlPr>
                 <w:rPr>
-                  <w:rFonts w:ascii="Cambria Math" w:hAnsi="Cambria Math"/>
+                  <w:rFonts w:ascii="Cambria Math" w:eastAsia="Cambria Math" w:hAnsi="Cambria Math" w:cs="Cambria Math"/>
                   <w:i/>
                 </w:rPr>
               </m:ctrlPr>
@@ -9676,7 +9688,7 @@
                 <m:sSubPr>
                   <m:ctrlPr>
                     <w:rPr>
-                      <w:rFonts w:ascii="Cambria Math" w:hAnsi="Cambria Math"/>
+                      <w:rFonts w:ascii="Cambria Math" w:eastAsia="Cambria Math" w:hAnsi="Cambria Math" w:cs="Cambria Math"/>
                       <w:i/>
                     </w:rPr>
                   </m:ctrlPr>
@@ -9684,7 +9696,7 @@
                 <m:e>
                   <m:r>
                     <w:rPr>
-                      <w:rFonts w:ascii="Cambria Math" w:hAnsi="Cambria Math"/>
+                      <w:rFonts w:ascii="Cambria Math" w:eastAsia="Cambria Math" w:hAnsi="Cambria Math" w:cs="Cambria Math"/>
                     </w:rPr>
                     <m:t>f</m:t>
                   </m:r>
@@ -9695,7 +9707,7 @@
                       <m:nor/>
                     </m:rPr>
                     <w:rPr>
-                      <w:rFonts w:ascii="Cambria Math" w:hAnsi="Cambria Math"/>
+                      <w:rFonts w:ascii="Cambria Math" w:eastAsia="Cambria Math" w:hAnsi="Cambria Math" w:cs="Cambria Math"/>
                     </w:rPr>
                     <m:t>pristine</m:t>
                   </m:r>
@@ -9703,7 +9715,7 @@
               </m:sSub>
               <m:ctrlPr>
                 <w:rPr>
-                  <w:rFonts w:ascii="Cambria Math" w:hAnsi="Cambria Math"/>
+                  <w:rFonts w:ascii="Cambria Math" w:eastAsia="Cambria Math" w:hAnsi="Cambria Math" w:cs="Cambria Math"/>
                   <w:i/>
                 </w:rPr>
               </m:ctrlPr>
@@ -9714,7 +9726,7 @@
               <m:sty m:val="p"/>
             </m:rPr>
             <w:rPr>
-              <w:rFonts w:ascii="Cambria Math" w:hAnsi="Cambria Math"/>
+              <w:rFonts w:ascii="Cambria Math" w:eastAsia="Cambria Math" w:hAnsi="Cambria Math" w:cs="Cambria Math"/>
             </w:rPr>
             <m:t>≈</m:t>
           </m:r>
@@ -9723,14 +9735,14 @@
               <m:degHide m:val="1"/>
               <m:ctrlPr>
                 <w:rPr>
-                  <w:rFonts w:ascii="Cambria Math" w:hAnsi="Cambria Math"/>
+                  <w:rFonts w:ascii="Cambria Math" w:eastAsia="Cambria Math" w:hAnsi="Cambria Math" w:cs="Cambria Math"/>
                 </w:rPr>
               </m:ctrlPr>
             </m:radPr>
             <m:deg>
               <m:ctrlPr>
                 <w:rPr>
-                  <w:rFonts w:ascii="Cambria Math" w:hAnsi="Cambria Math"/>
+                  <w:rFonts w:ascii="Cambria Math" w:eastAsia="Cambria Math" w:hAnsi="Cambria Math" w:cs="Cambria Math"/>
                   <w:i/>
                 </w:rPr>
               </m:ctrlPr>
@@ -9738,7 +9750,7 @@
             <m:e>
               <m:r>
                 <w:rPr>
-                  <w:rFonts w:ascii="Cambria Math" w:hAnsi="Cambria Math"/>
+                  <w:rFonts w:ascii="Cambria Math" w:eastAsia="Cambria Math" w:hAnsi="Cambria Math" w:cs="Cambria Math"/>
                 </w:rPr>
                 <m:t>1-</m:t>
               </m:r>
@@ -9747,7 +9759,7 @@
                   <m:sty m:val="p"/>
                 </m:rPr>
                 <w:rPr>
-                  <w:rFonts w:ascii="Cambria Math" w:hAnsi="Cambria Math"/>
+                  <w:rFonts w:ascii="Cambria Math" w:eastAsia="Cambria Math" w:hAnsi="Cambria Math" w:cs="Cambria Math"/>
                 </w:rPr>
                 <m:t>α</m:t>
               </m:r>
@@ -9755,7 +9767,7 @@
           </m:rad>
           <m:r>
             <w:rPr>
-              <w:rFonts w:ascii="Cambria Math" w:hAnsi="Cambria Math"/>
+              <w:rFonts w:ascii="Cambria Math" w:eastAsia="Cambria Math" w:hAnsi="Cambria Math" w:cs="Cambria Math"/>
             </w:rPr>
             <m:t>=</m:t>
           </m:r>
@@ -9764,14 +9776,14 @@
               <m:degHide m:val="1"/>
               <m:ctrlPr>
                 <w:rPr>
-                  <w:rFonts w:ascii="Cambria Math" w:hAnsi="Cambria Math"/>
+                  <w:rFonts w:ascii="Cambria Math" w:eastAsia="Cambria Math" w:hAnsi="Cambria Math" w:cs="Cambria Math"/>
                 </w:rPr>
               </m:ctrlPr>
             </m:radPr>
             <m:deg>
               <m:ctrlPr>
                 <w:rPr>
-                  <w:rFonts w:ascii="Cambria Math" w:hAnsi="Cambria Math"/>
+                  <w:rFonts w:ascii="Cambria Math" w:eastAsia="Cambria Math" w:hAnsi="Cambria Math" w:cs="Cambria Math"/>
                   <w:i/>
                 </w:rPr>
               </m:ctrlPr>
@@ -9779,7 +9791,7 @@
             <m:e>
               <m:r>
                 <w:rPr>
-                  <w:rFonts w:ascii="Cambria Math" w:hAnsi="Cambria Math"/>
+                  <w:rFonts w:ascii="Cambria Math" w:eastAsia="Cambria Math" w:hAnsi="Cambria Math" w:cs="Cambria Math"/>
                 </w:rPr>
                 <m:t>1-1.6</m:t>
               </m:r>
@@ -9788,7 +9800,7 @@
                   <m:sty m:val="p"/>
                 </m:rPr>
                 <w:rPr>
-                  <w:rFonts w:ascii="Cambria Math" w:hAnsi="Cambria Math"/>
+                  <w:rFonts w:ascii="Cambria Math" w:eastAsia="Cambria Math" w:hAnsi="Cambria Math" w:cs="Cambria Math"/>
                 </w:rPr>
                 <m:t>×</m:t>
               </m:r>
@@ -9796,20 +9808,20 @@
                 <m:fPr>
                   <m:ctrlPr>
                     <w:rPr>
-                      <w:rFonts w:ascii="Cambria Math" w:hAnsi="Cambria Math"/>
+                      <w:rFonts w:ascii="Cambria Math" w:eastAsia="Cambria Math" w:hAnsi="Cambria Math" w:cs="Cambria Math"/>
                     </w:rPr>
                   </m:ctrlPr>
                 </m:fPr>
                 <m:num>
                   <m:r>
                     <w:rPr>
-                      <w:rFonts w:ascii="Cambria Math" w:hAnsi="Cambria Math"/>
+                      <w:rFonts w:ascii="Cambria Math" w:eastAsia="Cambria Math" w:hAnsi="Cambria Math" w:cs="Cambria Math"/>
                     </w:rPr>
                     <m:t>C</m:t>
                   </m:r>
                   <m:ctrlPr>
                     <w:rPr>
-                      <w:rFonts w:ascii="Cambria Math" w:hAnsi="Cambria Math"/>
+                      <w:rFonts w:ascii="Cambria Math" w:eastAsia="Cambria Math" w:hAnsi="Cambria Math" w:cs="Cambria Math"/>
                       <w:i/>
                     </w:rPr>
                   </m:ctrlPr>
@@ -9817,13 +9829,13 @@
                 <m:den>
                   <m:r>
                     <w:rPr>
-                      <w:rFonts w:ascii="Cambria Math" w:hAnsi="Cambria Math"/>
+                      <w:rFonts w:ascii="Cambria Math" w:eastAsia="Cambria Math" w:hAnsi="Cambria Math" w:cs="Cambria Math"/>
                     </w:rPr>
                     <m:t>100</m:t>
                   </m:r>
                   <m:ctrlPr>
                     <w:rPr>
-                      <w:rFonts w:ascii="Cambria Math" w:hAnsi="Cambria Math"/>
+                      <w:rFonts w:ascii="Cambria Math" w:eastAsia="Cambria Math" w:hAnsi="Cambria Math" w:cs="Cambria Math"/>
                       <w:i/>
                     </w:rPr>
                   </m:ctrlPr>
@@ -9836,7 +9848,7 @@
               <m:sty m:val="p"/>
             </m:rPr>
             <w:rPr>
-              <w:rFonts w:ascii="Cambria Math" w:hAnsi="Cambria Math"/>
+              <w:rFonts w:ascii="Cambria Math" w:eastAsia="Cambria Math" w:hAnsi="Cambria Math" w:cs="Cambria Math"/>
             </w:rPr>
             <m:t> </m:t>
           </m:r>
@@ -9845,7 +9857,7 @@
               <m:nor/>
             </m:rPr>
             <w:rPr>
-              <w:rFonts w:ascii="Cambria Math" w:hAnsi="Cambria Math"/>
+              <w:rFonts w:ascii="Cambria Math" w:eastAsia="Cambria Math" w:hAnsi="Cambria Math" w:cs="Cambria Math"/>
             </w:rPr>
             <m:t>(Eq. 14)</m:t>
           </m:r>
@@ -9896,10 +9908,10 @@
           <w:noProof/>
         </w:rPr>
         <w:drawing>
-          <wp:inline distT="0" distB="0" distL="0" distR="0" wp14:anchorId="0677BB10" wp14:editId="3A500FA2">
+          <wp:inline distT="0" distB="0" distL="0" distR="0" wp14:anchorId="2E34D840" wp14:editId="3C58D77B">
             <wp:extent cx="4762500" cy="3333750"/>
             <wp:effectExtent l="0" t="0" r="0" b="0"/>
-            <wp:docPr id="1055773564" name="Picture 1055773564"/>
+            <wp:docPr id="405183320" name="Picture 405183320"/>
             <wp:cNvGraphicFramePr>
               <a:graphicFrameLocks xmlns:a="http://schemas.openxmlformats.org/drawingml/2006/main" noChangeAspect="1"/>
             </wp:cNvGraphicFramePr>
@@ -9989,10 +10001,10 @@
           <w:noProof/>
         </w:rPr>
         <w:drawing>
-          <wp:inline distT="0" distB="0" distL="0" distR="0" wp14:anchorId="2C7483E2" wp14:editId="0CF43A44">
+          <wp:inline distT="0" distB="0" distL="0" distR="0" wp14:anchorId="374F676B" wp14:editId="7C3F56A0">
             <wp:extent cx="4762500" cy="3333750"/>
             <wp:effectExtent l="0" t="0" r="0" b="0"/>
-            <wp:docPr id="101092080" name="Picture 101092080"/>
+            <wp:docPr id="1526829432" name="Picture 1526829432"/>
             <wp:cNvGraphicFramePr>
               <a:graphicFrameLocks xmlns:a="http://schemas.openxmlformats.org/drawingml/2006/main" noChangeAspect="1"/>
             </wp:cNvGraphicFramePr>
@@ -10066,13 +10078,13 @@
               <m:sty m:val="p"/>
             </m:rPr>
             <w:rPr>
-              <w:rFonts w:ascii="Cambria Math" w:hAnsi="Cambria Math"/>
+              <w:rFonts w:ascii="Cambria Math" w:eastAsia="Cambria Math" w:hAnsi="Cambria Math" w:cs="Cambria Math"/>
             </w:rPr>
             <m:t>Δ</m:t>
           </m:r>
           <m:r>
             <w:rPr>
-              <w:rFonts w:ascii="Cambria Math" w:hAnsi="Cambria Math"/>
+              <w:rFonts w:ascii="Cambria Math" w:eastAsia="Cambria Math" w:hAnsi="Cambria Math" w:cs="Cambria Math"/>
             </w:rPr>
             <m:t>f</m:t>
           </m:r>
@@ -10081,13 +10093,13 @@
               <m:sty m:val="p"/>
             </m:rPr>
             <w:rPr>
-              <w:rFonts w:ascii="Cambria Math" w:hAnsi="Cambria Math"/>
+              <w:rFonts w:ascii="Cambria Math" w:eastAsia="Cambria Math" w:hAnsi="Cambria Math" w:cs="Cambria Math"/>
             </w:rPr>
             <m:t>≈</m:t>
           </m:r>
           <m:r>
             <w:rPr>
-              <w:rFonts w:ascii="Cambria Math" w:hAnsi="Cambria Math"/>
+              <w:rFonts w:ascii="Cambria Math" w:eastAsia="Cambria Math" w:hAnsi="Cambria Math" w:cs="Cambria Math"/>
             </w:rPr>
             <m:t>-</m:t>
           </m:r>
@@ -10095,7 +10107,7 @@
             <m:sSubPr>
               <m:ctrlPr>
                 <w:rPr>
-                  <w:rFonts w:ascii="Cambria Math" w:hAnsi="Cambria Math"/>
+                  <w:rFonts w:ascii="Cambria Math" w:eastAsia="Cambria Math" w:hAnsi="Cambria Math" w:cs="Cambria Math"/>
                   <w:i/>
                 </w:rPr>
               </m:ctrlPr>
@@ -10103,7 +10115,7 @@
             <m:e>
               <m:r>
                 <w:rPr>
-                  <w:rFonts w:ascii="Cambria Math" w:hAnsi="Cambria Math"/>
+                  <w:rFonts w:ascii="Cambria Math" w:eastAsia="Cambria Math" w:hAnsi="Cambria Math" w:cs="Cambria Math"/>
                 </w:rPr>
                 <m:t>k</m:t>
               </m:r>
@@ -10111,7 +10123,7 @@
             <m:sub>
               <m:r>
                 <w:rPr>
-                  <w:rFonts w:ascii="Cambria Math" w:hAnsi="Cambria Math"/>
+                  <w:rFonts w:ascii="Cambria Math" w:eastAsia="Cambria Math" w:hAnsi="Cambria Math" w:cs="Cambria Math"/>
                 </w:rPr>
                 <m:t>1</m:t>
               </m:r>
@@ -10122,13 +10134,13 @@
               <m:sty m:val="p"/>
             </m:rPr>
             <w:rPr>
-              <w:rFonts w:ascii="Cambria Math" w:hAnsi="Cambria Math"/>
+              <w:rFonts w:ascii="Cambria Math" w:eastAsia="Cambria Math" w:hAnsi="Cambria Math" w:cs="Cambria Math"/>
             </w:rPr>
             <m:t>β</m:t>
           </m:r>
           <m:r>
             <w:rPr>
-              <w:rFonts w:ascii="Cambria Math" w:hAnsi="Cambria Math"/>
+              <w:rFonts w:ascii="Cambria Math" w:eastAsia="Cambria Math" w:hAnsi="Cambria Math" w:cs="Cambria Math"/>
             </w:rPr>
             <m:t>-</m:t>
           </m:r>
@@ -10136,7 +10148,7 @@
             <m:sSubPr>
               <m:ctrlPr>
                 <w:rPr>
-                  <w:rFonts w:ascii="Cambria Math" w:hAnsi="Cambria Math"/>
+                  <w:rFonts w:ascii="Cambria Math" w:eastAsia="Cambria Math" w:hAnsi="Cambria Math" w:cs="Cambria Math"/>
                   <w:i/>
                 </w:rPr>
               </m:ctrlPr>
@@ -10144,7 +10156,7 @@
             <m:e>
               <m:r>
                 <w:rPr>
-                  <w:rFonts w:ascii="Cambria Math" w:hAnsi="Cambria Math"/>
+                  <w:rFonts w:ascii="Cambria Math" w:eastAsia="Cambria Math" w:hAnsi="Cambria Math" w:cs="Cambria Math"/>
                 </w:rPr>
                 <m:t>k</m:t>
               </m:r>
@@ -10152,7 +10164,7 @@
             <m:sub>
               <m:r>
                 <w:rPr>
-                  <w:rFonts w:ascii="Cambria Math" w:hAnsi="Cambria Math"/>
+                  <w:rFonts w:ascii="Cambria Math" w:eastAsia="Cambria Math" w:hAnsi="Cambria Math" w:cs="Cambria Math"/>
                 </w:rPr>
                 <m:t>2</m:t>
               </m:r>
@@ -10162,7 +10174,7 @@
             <m:sSupPr>
               <m:ctrlPr>
                 <w:rPr>
-                  <w:rFonts w:ascii="Cambria Math" w:hAnsi="Cambria Math"/>
+                  <w:rFonts w:ascii="Cambria Math" w:eastAsia="Cambria Math" w:hAnsi="Cambria Math" w:cs="Cambria Math"/>
                   <w:i/>
                 </w:rPr>
               </m:ctrlPr>
@@ -10173,20 +10185,20 @@
                   <m:sty m:val="p"/>
                 </m:rPr>
                 <w:rPr>
-                  <w:rFonts w:ascii="Cambria Math" w:hAnsi="Cambria Math"/>
+                  <w:rFonts w:ascii="Cambria Math" w:eastAsia="Cambria Math" w:hAnsi="Cambria Math" w:cs="Cambria Math"/>
                 </w:rPr>
                 <m:t>β</m:t>
               </m:r>
               <m:ctrlPr>
                 <w:rPr>
-                  <w:rFonts w:ascii="Cambria Math" w:hAnsi="Cambria Math"/>
+                  <w:rFonts w:ascii="Cambria Math" w:eastAsia="Cambria Math" w:hAnsi="Cambria Math" w:cs="Cambria Math"/>
                 </w:rPr>
               </m:ctrlPr>
             </m:e>
             <m:sup>
               <m:r>
                 <w:rPr>
-                  <w:rFonts w:ascii="Cambria Math" w:hAnsi="Cambria Math"/>
+                  <w:rFonts w:ascii="Cambria Math" w:eastAsia="Cambria Math" w:hAnsi="Cambria Math" w:cs="Cambria Math"/>
                 </w:rPr>
                 <m:t>2</m:t>
               </m:r>
@@ -10197,7 +10209,7 @@
               <m:sty m:val="p"/>
             </m:rPr>
             <w:rPr>
-              <w:rFonts w:ascii="Cambria Math" w:hAnsi="Cambria Math"/>
+              <w:rFonts w:ascii="Cambria Math" w:eastAsia="Cambria Math" w:hAnsi="Cambria Math" w:cs="Cambria Math"/>
             </w:rPr>
             <m:t> </m:t>
           </m:r>
@@ -10206,7 +10218,7 @@
               <m:nor/>
             </m:rPr>
             <w:rPr>
-              <w:rFonts w:ascii="Cambria Math" w:hAnsi="Cambria Math"/>
+              <w:rFonts w:ascii="Cambria Math" w:eastAsia="Cambria Math" w:hAnsi="Cambria Math" w:cs="Cambria Math"/>
             </w:rPr>
             <m:t>(Eq. 15)</m:t>
           </m:r>
@@ -10670,7 +10682,7 @@
             <m:sSubPr>
               <m:ctrlPr>
                 <w:rPr>
-                  <w:rFonts w:ascii="Cambria Math" w:hAnsi="Cambria Math"/>
+                  <w:rFonts w:ascii="Cambria Math" w:eastAsia="Cambria Math" w:hAnsi="Cambria Math" w:cs="Cambria Math"/>
                   <w:i/>
                 </w:rPr>
               </m:ctrlPr>
@@ -10678,7 +10690,7 @@
             <m:e>
               <m:r>
                 <w:rPr>
-                  <w:rFonts w:ascii="Cambria Math" w:hAnsi="Cambria Math"/>
+                  <w:rFonts w:ascii="Cambria Math" w:eastAsia="Cambria Math" w:hAnsi="Cambria Math" w:cs="Cambria Math"/>
                 </w:rPr>
                 <m:t>S</m:t>
               </m:r>
@@ -10686,7 +10698,7 @@
             <m:sub>
               <m:r>
                 <w:rPr>
-                  <w:rFonts w:ascii="Cambria Math" w:hAnsi="Cambria Math"/>
+                  <w:rFonts w:ascii="Cambria Math" w:eastAsia="Cambria Math" w:hAnsi="Cambria Math" w:cs="Cambria Math"/>
                 </w:rPr>
                 <m:t>i</m:t>
               </m:r>
@@ -10694,7 +10706,7 @@
           </m:sSub>
           <m:r>
             <w:rPr>
-              <w:rFonts w:ascii="Cambria Math" w:hAnsi="Cambria Math"/>
+              <w:rFonts w:ascii="Cambria Math" w:eastAsia="Cambria Math" w:hAnsi="Cambria Math" w:cs="Cambria Math"/>
             </w:rPr>
             <m:t>=</m:t>
           </m:r>
@@ -10702,7 +10714,7 @@
             <m:fPr>
               <m:ctrlPr>
                 <w:rPr>
-                  <w:rFonts w:ascii="Cambria Math" w:hAnsi="Cambria Math"/>
+                  <w:rFonts w:ascii="Cambria Math" w:eastAsia="Cambria Math" w:hAnsi="Cambria Math" w:cs="Cambria Math"/>
                 </w:rPr>
               </m:ctrlPr>
             </m:fPr>
@@ -10712,19 +10724,19 @@
                   <m:sty m:val="p"/>
                 </m:rPr>
                 <w:rPr>
-                  <w:rFonts w:ascii="Cambria Math" w:hAnsi="Cambria Math"/>
+                  <w:rFonts w:ascii="Cambria Math" w:eastAsia="Cambria Math" w:hAnsi="Cambria Math" w:cs="Cambria Math"/>
                 </w:rPr>
                 <m:t>∂</m:t>
               </m:r>
               <m:r>
                 <w:rPr>
-                  <w:rFonts w:ascii="Cambria Math" w:hAnsi="Cambria Math"/>
+                  <w:rFonts w:ascii="Cambria Math" w:eastAsia="Cambria Math" w:hAnsi="Cambria Math" w:cs="Cambria Math"/>
                 </w:rPr>
                 <m:t>f</m:t>
               </m:r>
               <m:ctrlPr>
                 <w:rPr>
-                  <w:rFonts w:ascii="Cambria Math" w:hAnsi="Cambria Math"/>
+                  <w:rFonts w:ascii="Cambria Math" w:eastAsia="Cambria Math" w:hAnsi="Cambria Math" w:cs="Cambria Math"/>
                   <w:i/>
                 </w:rPr>
               </m:ctrlPr>
@@ -10735,7 +10747,7 @@
                   <m:sty m:val="p"/>
                 </m:rPr>
                 <w:rPr>
-                  <w:rFonts w:ascii="Cambria Math" w:hAnsi="Cambria Math"/>
+                  <w:rFonts w:ascii="Cambria Math" w:eastAsia="Cambria Math" w:hAnsi="Cambria Math" w:cs="Cambria Math"/>
                 </w:rPr>
                 <m:t>∂</m:t>
               </m:r>
@@ -10743,7 +10755,7 @@
                 <m:sSubPr>
                   <m:ctrlPr>
                     <w:rPr>
-                      <w:rFonts w:ascii="Cambria Math" w:hAnsi="Cambria Math"/>
+                      <w:rFonts w:ascii="Cambria Math" w:eastAsia="Cambria Math" w:hAnsi="Cambria Math" w:cs="Cambria Math"/>
                       <w:i/>
                     </w:rPr>
                   </m:ctrlPr>
@@ -10751,7 +10763,7 @@
                 <m:e>
                   <m:r>
                     <w:rPr>
-                      <w:rFonts w:ascii="Cambria Math" w:hAnsi="Cambria Math"/>
+                      <w:rFonts w:ascii="Cambria Math" w:eastAsia="Cambria Math" w:hAnsi="Cambria Math" w:cs="Cambria Math"/>
                     </w:rPr>
                     <m:t>p</m:t>
                   </m:r>
@@ -10759,7 +10771,7 @@
                 <m:sub>
                   <m:r>
                     <w:rPr>
-                      <w:rFonts w:ascii="Cambria Math" w:hAnsi="Cambria Math"/>
+                      <w:rFonts w:ascii="Cambria Math" w:eastAsia="Cambria Math" w:hAnsi="Cambria Math" w:cs="Cambria Math"/>
                     </w:rPr>
                     <m:t>i</m:t>
                   </m:r>
@@ -10767,7 +10779,7 @@
               </m:sSub>
               <m:ctrlPr>
                 <w:rPr>
-                  <w:rFonts w:ascii="Cambria Math" w:hAnsi="Cambria Math"/>
+                  <w:rFonts w:ascii="Cambria Math" w:eastAsia="Cambria Math" w:hAnsi="Cambria Math" w:cs="Cambria Math"/>
                   <w:i/>
                 </w:rPr>
               </m:ctrlPr>
@@ -10778,7 +10790,7 @@
               <m:sty m:val="p"/>
             </m:rPr>
             <w:rPr>
-              <w:rFonts w:ascii="Cambria Math" w:hAnsi="Cambria Math"/>
+              <w:rFonts w:ascii="Cambria Math" w:eastAsia="Cambria Math" w:hAnsi="Cambria Math" w:cs="Cambria Math"/>
             </w:rPr>
             <m:t>×</m:t>
           </m:r>
@@ -10786,7 +10798,7 @@
             <m:fPr>
               <m:ctrlPr>
                 <w:rPr>
-                  <w:rFonts w:ascii="Cambria Math" w:hAnsi="Cambria Math"/>
+                  <w:rFonts w:ascii="Cambria Math" w:eastAsia="Cambria Math" w:hAnsi="Cambria Math" w:cs="Cambria Math"/>
                 </w:rPr>
               </m:ctrlPr>
             </m:fPr>
@@ -10795,7 +10807,7 @@
                 <m:sSubPr>
                   <m:ctrlPr>
                     <w:rPr>
-                      <w:rFonts w:ascii="Cambria Math" w:hAnsi="Cambria Math"/>
+                      <w:rFonts w:ascii="Cambria Math" w:eastAsia="Cambria Math" w:hAnsi="Cambria Math" w:cs="Cambria Math"/>
                       <w:i/>
                     </w:rPr>
                   </m:ctrlPr>
@@ -10803,7 +10815,7 @@
                 <m:e>
                   <m:r>
                     <w:rPr>
-                      <w:rFonts w:ascii="Cambria Math" w:hAnsi="Cambria Math"/>
+                      <w:rFonts w:ascii="Cambria Math" w:eastAsia="Cambria Math" w:hAnsi="Cambria Math" w:cs="Cambria Math"/>
                     </w:rPr>
                     <m:t>p</m:t>
                   </m:r>
@@ -10811,7 +10823,7 @@
                 <m:sub>
                   <m:r>
                     <w:rPr>
-                      <w:rFonts w:ascii="Cambria Math" w:hAnsi="Cambria Math"/>
+                      <w:rFonts w:ascii="Cambria Math" w:eastAsia="Cambria Math" w:hAnsi="Cambria Math" w:cs="Cambria Math"/>
                     </w:rPr>
                     <m:t>i</m:t>
                   </m:r>
@@ -10819,7 +10831,7 @@
               </m:sSub>
               <m:ctrlPr>
                 <w:rPr>
-                  <w:rFonts w:ascii="Cambria Math" w:hAnsi="Cambria Math"/>
+                  <w:rFonts w:ascii="Cambria Math" w:eastAsia="Cambria Math" w:hAnsi="Cambria Math" w:cs="Cambria Math"/>
                   <w:i/>
                 </w:rPr>
               </m:ctrlPr>
@@ -10827,13 +10839,13 @@
             <m:den>
               <m:r>
                 <w:rPr>
-                  <w:rFonts w:ascii="Cambria Math" w:hAnsi="Cambria Math"/>
+                  <w:rFonts w:ascii="Cambria Math" w:eastAsia="Cambria Math" w:hAnsi="Cambria Math" w:cs="Cambria Math"/>
                 </w:rPr>
                 <m:t>f</m:t>
               </m:r>
               <m:ctrlPr>
                 <w:rPr>
-                  <w:rFonts w:ascii="Cambria Math" w:hAnsi="Cambria Math"/>
+                  <w:rFonts w:ascii="Cambria Math" w:eastAsia="Cambria Math" w:hAnsi="Cambria Math" w:cs="Cambria Math"/>
                   <w:i/>
                 </w:rPr>
               </m:ctrlPr>
@@ -10844,7 +10856,7 @@
               <m:sty m:val="p"/>
             </m:rPr>
             <w:rPr>
-              <w:rFonts w:ascii="Cambria Math" w:hAnsi="Cambria Math"/>
+              <w:rFonts w:ascii="Cambria Math" w:eastAsia="Cambria Math" w:hAnsi="Cambria Math" w:cs="Cambria Math"/>
             </w:rPr>
             <m:t> </m:t>
           </m:r>
@@ -10853,7 +10865,7 @@
               <m:nor/>
             </m:rPr>
             <w:rPr>
-              <w:rFonts w:ascii="Cambria Math" w:hAnsi="Cambria Math"/>
+              <w:rFonts w:ascii="Cambria Math" w:eastAsia="Cambria Math" w:hAnsi="Cambria Math" w:cs="Cambria Math"/>
             </w:rPr>
             <m:t>(Eq. 16)</m:t>
           </m:r>
@@ -10873,7 +10885,38 @@
         <w:jc w:val="both"/>
       </w:pPr>
       <w:r>
-        <w:t>where p_i is the i-th parameter.</w:t>
+        <w:t xml:space="preserve">where </w:t>
+      </w:r>
+      <m:oMath>
+        <m:sSub>
+          <m:sSubPr>
+            <m:ctrlPr>
+              <w:rPr>
+                <w:rFonts w:ascii="Cambria Math" w:hAnsi="Cambria Math"/>
+                <w:i/>
+              </w:rPr>
+            </m:ctrlPr>
+          </m:sSubPr>
+          <m:e>
+            <m:r>
+              <w:rPr>
+                <w:rFonts w:ascii="Cambria Math" w:hAnsi="Cambria Math"/>
+              </w:rPr>
+              <m:t>p</m:t>
+            </m:r>
+          </m:e>
+          <m:sub>
+            <m:r>
+              <w:rPr>
+                <w:rFonts w:ascii="Cambria Math" w:hAnsi="Cambria Math"/>
+              </w:rPr>
+              <m:t>i</m:t>
+            </m:r>
+          </m:sub>
+        </m:sSub>
+      </m:oMath>
+      <w:r>
+        <w:t xml:space="preserve"> is the i-th parameter.</w:t>
       </w:r>
     </w:p>
     <w:p>
@@ -10891,7 +10934,44 @@
         <w:jc w:val="both"/>
       </w:pPr>
       <w:r>
-        <w:t>Length exhibits the highest sensitivity (-2.00), consistent with the theoretical f proportional to L^-2 relationship (Clough &amp; Penzien, 2003), while corrosion sensitivity (-0.80) confirms its detectability in SHM applications.</w:t>
+        <w:t xml:space="preserve">Length exhibits the highest sensitivity (-2.00), consistent with the theoretical f proportional to </w:t>
+      </w:r>
+      <m:oMath>
+        <m:sSup>
+          <m:sSupPr>
+            <m:ctrlPr>
+              <w:rPr>
+                <w:rFonts w:ascii="Cambria Math" w:hAnsi="Cambria Math"/>
+                <w:i/>
+              </w:rPr>
+            </m:ctrlPr>
+          </m:sSupPr>
+          <m:e>
+            <m:r>
+              <w:rPr>
+                <w:rFonts w:ascii="Cambria Math" w:hAnsi="Cambria Math"/>
+              </w:rPr>
+              <m:t>L</m:t>
+            </m:r>
+          </m:e>
+          <m:sup>
+            <m:r>
+              <w:rPr>
+                <w:rFonts w:ascii="Cambria Math" w:hAnsi="Cambria Math"/>
+              </w:rPr>
+              <m:t>-</m:t>
+            </m:r>
+            <m:r>
+              <w:rPr>
+                <w:rFonts w:ascii="Cambria Math" w:hAnsi="Cambria Math"/>
+              </w:rPr>
+              <m:t>2</m:t>
+            </m:r>
+          </m:sup>
+        </m:sSup>
+      </m:oMath>
+      <w:r>
+        <w:t xml:space="preserve"> relationship (Clough &amp; Penzien, 2003), while corrosion sensitivity (-0.80) confirms its detectability in SHM applications.</w:t>
       </w:r>
     </w:p>
     <w:p>
@@ -12245,10 +12325,10 @@
         </w:rPr>
         <w:lastRenderedPageBreak/>
         <w:drawing>
-          <wp:inline distT="0" distB="0" distL="0" distR="0" wp14:anchorId="106BE8EB" wp14:editId="6206333A">
-            <wp:extent cx="5732780" cy="1909720"/>
+          <wp:inline distT="0" distB="0" distL="0" distR="0" wp14:anchorId="24EB2167" wp14:editId="101ABFF8">
+            <wp:extent cx="5744308" cy="1881438"/>
             <wp:effectExtent l="0" t="0" r="0" b="0"/>
-            <wp:docPr id="518041782" name="Picture 518041782"/>
+            <wp:docPr id="651797362" name="Picture 651797362"/>
             <wp:cNvGraphicFramePr>
               <a:graphicFrameLocks xmlns:a="http://schemas.openxmlformats.org/drawingml/2006/main" noChangeAspect="1"/>
             </wp:cNvGraphicFramePr>
@@ -12271,7 +12351,7 @@
                   <pic:spPr bwMode="auto">
                     <a:xfrm>
                       <a:off x="0" y="0"/>
-                      <a:ext cx="5782078" cy="1926142"/>
+                      <a:ext cx="5847197" cy="1915137"/>
                     </a:xfrm>
                     <a:prstGeom prst="rect">
                       <a:avLst/>
@@ -12319,10 +12399,10 @@
           <w:noProof/>
         </w:rPr>
         <w:drawing>
-          <wp:inline distT="0" distB="0" distL="0" distR="0" wp14:anchorId="42FB9658" wp14:editId="2A842C00">
-            <wp:extent cx="5683745" cy="3978622"/>
-            <wp:effectExtent l="0" t="0" r="0" b="0"/>
-            <wp:docPr id="1718058796" name="Picture 1718058796"/>
+          <wp:inline distT="0" distB="0" distL="0" distR="0" wp14:anchorId="559E1827" wp14:editId="11165323">
+            <wp:extent cx="5580184" cy="3906129"/>
+            <wp:effectExtent l="0" t="0" r="0" b="5715"/>
+            <wp:docPr id="1752218500" name="Picture 1752218500"/>
             <wp:cNvGraphicFramePr>
               <a:graphicFrameLocks xmlns:a="http://schemas.openxmlformats.org/drawingml/2006/main" noChangeAspect="1"/>
             </wp:cNvGraphicFramePr>
@@ -12345,7 +12425,7 @@
                   <pic:spPr bwMode="auto">
                     <a:xfrm>
                       <a:off x="0" y="0"/>
-                      <a:ext cx="5730332" cy="4011233"/>
+                      <a:ext cx="5614491" cy="3930144"/>
                     </a:xfrm>
                     <a:prstGeom prst="rect">
                       <a:avLst/>
@@ -12394,10 +12474,10 @@
         </w:rPr>
         <w:lastRenderedPageBreak/>
         <w:drawing>
-          <wp:inline distT="0" distB="0" distL="0" distR="0" wp14:anchorId="100FE3F2" wp14:editId="7695B595">
-            <wp:extent cx="5560695" cy="1961804"/>
-            <wp:effectExtent l="0" t="0" r="1905" b="0"/>
-            <wp:docPr id="706919294" name="Picture 706919294"/>
+          <wp:inline distT="0" distB="0" distL="0" distR="0" wp14:anchorId="1391F892" wp14:editId="45DB0BB1">
+            <wp:extent cx="5567742" cy="1992923"/>
+            <wp:effectExtent l="0" t="0" r="0" b="1270"/>
+            <wp:docPr id="958599131" name="Picture 958599131"/>
             <wp:cNvGraphicFramePr>
               <a:graphicFrameLocks xmlns:a="http://schemas.openxmlformats.org/drawingml/2006/main" noChangeAspect="1"/>
             </wp:cNvGraphicFramePr>
@@ -12420,7 +12500,7 @@
                   <pic:spPr bwMode="auto">
                     <a:xfrm>
                       <a:off x="0" y="0"/>
-                      <a:ext cx="5647500" cy="1992429"/>
+                      <a:ext cx="5640650" cy="2019020"/>
                     </a:xfrm>
                     <a:prstGeom prst="rect">
                       <a:avLst/>
@@ -12468,10 +12548,10 @@
           <w:noProof/>
         </w:rPr>
         <w:drawing>
-          <wp:inline distT="0" distB="0" distL="0" distR="0" wp14:anchorId="72F09765" wp14:editId="63A84459">
-            <wp:extent cx="5590310" cy="1975339"/>
-            <wp:effectExtent l="0" t="0" r="0" b="6350"/>
-            <wp:docPr id="761850175" name="Picture 761850175"/>
+          <wp:inline distT="0" distB="0" distL="0" distR="0" wp14:anchorId="41CC5C17" wp14:editId="75431468">
+            <wp:extent cx="5568315" cy="1758461"/>
+            <wp:effectExtent l="0" t="0" r="0" b="0"/>
+            <wp:docPr id="1814606044" name="Picture 1814606044"/>
             <wp:cNvGraphicFramePr>
               <a:graphicFrameLocks xmlns:a="http://schemas.openxmlformats.org/drawingml/2006/main" noChangeAspect="1"/>
             </wp:cNvGraphicFramePr>
@@ -12494,7 +12574,7 @@
                   <pic:spPr bwMode="auto">
                     <a:xfrm>
                       <a:off x="0" y="0"/>
-                      <a:ext cx="5643137" cy="1994006"/>
+                      <a:ext cx="5619016" cy="1774472"/>
                     </a:xfrm>
                     <a:prstGeom prst="rect">
                       <a:avLst/>
@@ -12529,7 +12609,44 @@
         <w:jc w:val="both"/>
       </w:pPr>
       <w:r>
-        <w:t>Feature Importance Rankings: Length (Importance about 0.45): Most influential parameter, consistent with theoretical frequency dependence f proportional to L^-2. Damage Severity (about 0.25): Second most critical, reflecting direct impact on stiffness degradation. Depth (about 0.15): Significant contributor through moment of inertia influence. Concrete Strength (about 0.10): Moderate importance via elastic modulus relationship.</w:t>
+        <w:t xml:space="preserve">Feature Importance Rankings: Length (Importance about 0.45): Most influential parameter, consistent with theoretical frequency dependence f proportional to </w:t>
+      </w:r>
+      <m:oMath>
+        <m:sSup>
+          <m:sSupPr>
+            <m:ctrlPr>
+              <w:rPr>
+                <w:rFonts w:ascii="Cambria Math" w:hAnsi="Cambria Math"/>
+                <w:i/>
+              </w:rPr>
+            </m:ctrlPr>
+          </m:sSupPr>
+          <m:e>
+            <m:r>
+              <w:rPr>
+                <w:rFonts w:ascii="Cambria Math" w:hAnsi="Cambria Math"/>
+              </w:rPr>
+              <m:t>L</m:t>
+            </m:r>
+          </m:e>
+          <m:sup>
+            <m:r>
+              <w:rPr>
+                <w:rFonts w:ascii="Cambria Math" w:hAnsi="Cambria Math"/>
+              </w:rPr>
+              <m:t>-</m:t>
+            </m:r>
+            <m:r>
+              <w:rPr>
+                <w:rFonts w:ascii="Cambria Math" w:hAnsi="Cambria Math"/>
+              </w:rPr>
+              <m:t>2</m:t>
+            </m:r>
+          </m:sup>
+        </m:sSup>
+      </m:oMath>
+      <w:r>
+        <w:t>. Damage Severity (about 0.25): Second most critical, reflecting direct impact on stiffness degradation. Depth (about 0.15): Significant contributor through moment of inertia influence. Concrete Strength (about 0.10): Moderate importance via elastic modulus relationship.</w:t>
       </w:r>
     </w:p>
     <w:p>
@@ -12552,10 +12669,10 @@
         </w:rPr>
         <w:lastRenderedPageBreak/>
         <w:drawing>
-          <wp:inline distT="0" distB="0" distL="0" distR="0" wp14:anchorId="296A8537" wp14:editId="1CED9467">
-            <wp:extent cx="5521325" cy="3118338"/>
-            <wp:effectExtent l="0" t="0" r="3175" b="6350"/>
-            <wp:docPr id="297765225" name="Picture 297765225"/>
+          <wp:inline distT="0" distB="0" distL="0" distR="0" wp14:anchorId="0AB9100B" wp14:editId="78A93203">
+            <wp:extent cx="4762500" cy="3333750"/>
+            <wp:effectExtent l="0" t="0" r="0" b="0"/>
+            <wp:docPr id="116543641" name="Picture 116543641"/>
             <wp:cNvGraphicFramePr>
               <a:graphicFrameLocks xmlns:a="http://schemas.openxmlformats.org/drawingml/2006/main" noChangeAspect="1"/>
             </wp:cNvGraphicFramePr>
@@ -12578,7 +12695,7 @@
                   <pic:spPr bwMode="auto">
                     <a:xfrm>
                       <a:off x="0" y="0"/>
-                      <a:ext cx="5543029" cy="3130596"/>
+                      <a:ext cx="4762500" cy="3333750"/>
                     </a:xfrm>
                     <a:prstGeom prst="rect">
                       <a:avLst/>
@@ -12663,10 +12780,10 @@
         </w:rPr>
         <w:lastRenderedPageBreak/>
         <w:drawing>
-          <wp:inline distT="0" distB="0" distL="0" distR="0" wp14:anchorId="74AECD81" wp14:editId="3E282FC3">
-            <wp:extent cx="5620192" cy="2813538"/>
-            <wp:effectExtent l="0" t="0" r="0" b="6350"/>
-            <wp:docPr id="232021622" name="Picture 232021622"/>
+          <wp:inline distT="0" distB="0" distL="0" distR="0" wp14:anchorId="0DF089E4" wp14:editId="75CDCD7C">
+            <wp:extent cx="5655945" cy="2708031"/>
+            <wp:effectExtent l="0" t="0" r="0" b="0"/>
+            <wp:docPr id="2048242656" name="Picture 2048242656"/>
             <wp:cNvGraphicFramePr>
               <a:graphicFrameLocks xmlns:a="http://schemas.openxmlformats.org/drawingml/2006/main" noChangeAspect="1"/>
             </wp:cNvGraphicFramePr>
@@ -12689,7 +12806,7 @@
                   <pic:spPr bwMode="auto">
                     <a:xfrm>
                       <a:off x="0" y="0"/>
-                      <a:ext cx="5667416" cy="2837179"/>
+                      <a:ext cx="5676358" cy="2717804"/>
                     </a:xfrm>
                     <a:prstGeom prst="rect">
                       <a:avLst/>
@@ -13080,10 +13197,10 @@
           <w:noProof/>
         </w:rPr>
         <w:drawing>
-          <wp:inline distT="0" distB="0" distL="0" distR="0" wp14:anchorId="5F467C75" wp14:editId="4FEB8375">
-            <wp:extent cx="3918856" cy="2743200"/>
-            <wp:effectExtent l="0" t="0" r="5715" b="0"/>
-            <wp:docPr id="2033258227" name="Picture 2033258227"/>
+          <wp:inline distT="0" distB="0" distL="0" distR="0" wp14:anchorId="2C984A15" wp14:editId="145DFD0A">
+            <wp:extent cx="4062046" cy="2843432"/>
+            <wp:effectExtent l="0" t="0" r="2540" b="1905"/>
+            <wp:docPr id="2120096543" name="Picture 2120096543"/>
             <wp:cNvGraphicFramePr>
               <a:graphicFrameLocks xmlns:a="http://schemas.openxmlformats.org/drawingml/2006/main" noChangeAspect="1"/>
             </wp:cNvGraphicFramePr>
@@ -13106,7 +13223,7 @@
                   <pic:spPr bwMode="auto">
                     <a:xfrm>
                       <a:off x="0" y="0"/>
-                      <a:ext cx="3966467" cy="2776528"/>
+                      <a:ext cx="4085740" cy="2860018"/>
                     </a:xfrm>
                     <a:prstGeom prst="rect">
                       <a:avLst/>
@@ -13200,10 +13317,10 @@
           <w:noProof/>
         </w:rPr>
         <w:drawing>
-          <wp:inline distT="0" distB="0" distL="0" distR="0" wp14:anchorId="5514264F" wp14:editId="4CCBA30B">
-            <wp:extent cx="5715000" cy="4000501"/>
-            <wp:effectExtent l="0" t="0" r="0" b="0"/>
-            <wp:docPr id="473001410" name="Picture 473001410"/>
+          <wp:inline distT="0" distB="0" distL="0" distR="0" wp14:anchorId="7334015B" wp14:editId="21C7BF38">
+            <wp:extent cx="5727560" cy="4009292"/>
+            <wp:effectExtent l="0" t="0" r="635" b="4445"/>
+            <wp:docPr id="85593105" name="Picture 85593105"/>
             <wp:cNvGraphicFramePr>
               <a:graphicFrameLocks xmlns:a="http://schemas.openxmlformats.org/drawingml/2006/main" noChangeAspect="1"/>
             </wp:cNvGraphicFramePr>
@@ -13226,7 +13343,7 @@
                   <pic:spPr bwMode="auto">
                     <a:xfrm>
                       <a:off x="0" y="0"/>
-                      <a:ext cx="5754136" cy="4027896"/>
+                      <a:ext cx="5759420" cy="4031594"/>
                     </a:xfrm>
                     <a:prstGeom prst="rect">
                       <a:avLst/>
@@ -16561,10 +16678,10 @@
 <file path=word/numbering.xml><?xml version="1.0" encoding="utf-8"?>
 <w:numbering xmlns:wpc="http://schemas.microsoft.com/office/word/2010/wordprocessingCanvas" xmlns:cx="http://schemas.microsoft.com/office/drawing/2014/chartex" xmlns:cx1="http://schemas.microsoft.com/office/drawing/2015/9/8/chartex" xmlns:cx2="http://schemas.microsoft.com/office/drawing/2015/10/21/chartex" xmlns:cx3="http://schemas.microsoft.com/office/drawing/2016/5/9/chartex" xmlns:cx4="http://schemas.microsoft.com/office/drawing/2016/5/10/chartex" xmlns:cx5="http://schemas.microsoft.com/office/drawing/2016/5/11/chartex" xmlns:cx6="http://schemas.microsoft.com/office/drawing/2016/5/12/chartex" xmlns:cx7="http://schemas.microsoft.com/office/drawing/2016/5/13/chartex" xmlns:cx8="http://schemas.microsoft.com/office/drawing/2016/5/14/chartex" xmlns:mc="http://schemas.openxmlformats.org/markup-compatibility/2006" xmlns:aink="http://schemas.microsoft.com/office/drawing/2016/ink" xmlns:am3d="http://schemas.microsoft.com/office/drawing/2017/model3d" xmlns:o="urn:schemas-microsoft-com:office:office" xmlns:oel="http://schemas.microsoft.com/office/2019/extlst" xmlns:r="http://schemas.openxmlformats.org/officeDocument/2006/relationships" xmlns:m="http://schemas.openxmlformats.org/officeDocument/2006/math" xmlns:v="urn:schemas-microsoft-com:vml" xmlns:wp14="http://schemas.microsoft.com/office/word/2010/wordprocessingDrawing" xmlns:wp="http://schemas.openxmlformats.org/drawingml/2006/wordprocessingDrawing" xmlns:w10="urn:schemas-microsoft-com:office:word" xmlns:w="http://schemas.openxmlformats.org/wordprocessingml/2006/main" xmlns:w14="http://schemas.microsoft.com/office/word/2010/wordml" xmlns:w15="http://schemas.microsoft.com/office/word/2012/wordml" xmlns:w16cex="http://schemas.microsoft.com/office/word/2018/wordml/cex" xmlns:w16cid="http://schemas.microsoft.com/office/word/2016/wordml/cid" xmlns:w16="http://schemas.microsoft.com/office/word/2018/wordml" xmlns:w16du="http://schemas.microsoft.com/office/word/2023/wordml/word16du" xmlns:w16sdtdh="http://schemas.microsoft.com/office/word/2020/wordml/sdtdatahash" xmlns:w16sdtfl="http://schemas.microsoft.com/office/word/2024/wordml/sdtformatlock" xmlns:w16se="http://schemas.microsoft.com/office/word/2015/wordml/symex" xmlns:wpg="http://schemas.microsoft.com/office/word/2010/wordprocessingGroup" xmlns:wpi="http://schemas.microsoft.com/office/word/2010/wordprocessingInk" xmlns:wne="http://schemas.microsoft.com/office/word/2006/wordml" xmlns:wps="http://schemas.microsoft.com/office/word/2010/wordprocessingShape" mc:Ignorable="w14 w15 w16se w16cid w16 w16cex w16sdtdh w16sdtfl w16du wp14">
   <w:abstractNum w:abstractNumId="0" w15:restartNumberingAfterBreak="0">
-    <w:nsid w:val="6FAE3806"/>
+    <w:nsid w:val="3C054A4F"/>
     <w:multiLevelType w:val="hybridMultilevel"/>
-    <w:tmpl w:val="18943F56"/>
-    <w:lvl w:ilvl="0" w:tplc="15ACCF64">
+    <w:tmpl w:val="E354C4FC"/>
+    <w:lvl w:ilvl="0" w:tplc="A30EED00">
       <w:start w:val="1"/>
       <w:numFmt w:val="bullet"/>
       <w:lvlText w:val="●"/>
@@ -16573,7 +16690,7 @@
         <w:ind w:left="720" w:hanging="360"/>
       </w:pPr>
     </w:lvl>
-    <w:lvl w:ilvl="1" w:tplc="DD883248">
+    <w:lvl w:ilvl="1" w:tplc="B23E838E">
       <w:start w:val="1"/>
       <w:numFmt w:val="bullet"/>
       <w:lvlText w:val="○"/>
@@ -16582,7 +16699,7 @@
         <w:ind w:left="1440" w:hanging="360"/>
       </w:pPr>
     </w:lvl>
-    <w:lvl w:ilvl="2" w:tplc="543E4206">
+    <w:lvl w:ilvl="2" w:tplc="4CD87162">
       <w:start w:val="1"/>
       <w:numFmt w:val="bullet"/>
       <w:lvlText w:val="■"/>
@@ -16591,7 +16708,7 @@
         <w:ind w:left="2160" w:hanging="360"/>
       </w:pPr>
     </w:lvl>
-    <w:lvl w:ilvl="3" w:tplc="61AC953C">
+    <w:lvl w:ilvl="3" w:tplc="3208BF94">
       <w:start w:val="1"/>
       <w:numFmt w:val="bullet"/>
       <w:lvlText w:val="●"/>
@@ -16600,7 +16717,7 @@
         <w:ind w:left="2880" w:hanging="360"/>
       </w:pPr>
     </w:lvl>
-    <w:lvl w:ilvl="4" w:tplc="8A50BF6C">
+    <w:lvl w:ilvl="4" w:tplc="3F16B9DE">
       <w:start w:val="1"/>
       <w:numFmt w:val="bullet"/>
       <w:lvlText w:val="○"/>
@@ -16609,7 +16726,7 @@
         <w:ind w:left="3600" w:hanging="360"/>
       </w:pPr>
     </w:lvl>
-    <w:lvl w:ilvl="5" w:tplc="2F54FEF6">
+    <w:lvl w:ilvl="5" w:tplc="334E9DA2">
       <w:start w:val="1"/>
       <w:numFmt w:val="bullet"/>
       <w:lvlText w:val="■"/>
@@ -16618,7 +16735,7 @@
         <w:ind w:left="4320" w:hanging="360"/>
       </w:pPr>
     </w:lvl>
-    <w:lvl w:ilvl="6" w:tplc="D516440A">
+    <w:lvl w:ilvl="6" w:tplc="C89454AA">
       <w:start w:val="1"/>
       <w:numFmt w:val="bullet"/>
       <w:lvlText w:val="●"/>
@@ -16627,7 +16744,7 @@
         <w:ind w:left="5040" w:hanging="360"/>
       </w:pPr>
     </w:lvl>
-    <w:lvl w:ilvl="7" w:tplc="CA442DB8">
+    <w:lvl w:ilvl="7" w:tplc="722A1C38">
       <w:start w:val="1"/>
       <w:numFmt w:val="bullet"/>
       <w:lvlText w:val="●"/>
@@ -16636,7 +16753,7 @@
         <w:ind w:left="5760" w:hanging="360"/>
       </w:pPr>
     </w:lvl>
-    <w:lvl w:ilvl="8" w:tplc="3A763A76">
+    <w:lvl w:ilvl="8" w:tplc="F2A2C664">
       <w:start w:val="1"/>
       <w:numFmt w:val="bullet"/>
       <w:lvlText w:val="●"/>
@@ -16646,7 +16763,7 @@
       </w:pPr>
     </w:lvl>
   </w:abstractNum>
-  <w:num w:numId="1" w16cid:durableId="1551844662">
+  <w:num w:numId="1" w16cid:durableId="291863397">
     <w:abstractNumId w:val="0"/>
     <w:lvlOverride w:ilvl="0">
       <w:startOverride w:val="1"/>
@@ -17224,7 +17341,7 @@
     <w:basedOn w:val="DefaultParagraphFont"/>
     <w:uiPriority w:val="99"/>
     <w:semiHidden/>
-    <w:rsid w:val="008365D1"/>
+    <w:rsid w:val="00296078"/>
     <w:rPr>
       <w:color w:val="666666"/>
     </w:rPr>

</xml_diff>